<commit_message>
docs(cadrage): perturbation J1 - Mme Lefevre passe persona principale
- personas.md: "Mme Nadia" (secondaire/R2) remplacee par Mme Sophie Lefevre
  (42 ans, BTS Communication Lyon, 28 etudiants), promue persona primaire #3
  au meme niveau que l'etudiant ; besoins/citation conformes a l'enonce du cours
  (suivi de classe, reperage decrocheurs, conseils) -> US-T.1/T.2/T.3 must-have
- perturbations/j1-produit.md: journal de la perturbation J1 (annonce, decision,
  impacts backlog, MoSCoW, tracabilite + ecart "secondaire" assume)
- generate.py: regeneration des .docx depuis le Markdown (source de verite)
- docx regeneres: personas.docx, perturbations/j1-produit.docx

Co-Authored-By: Claude Opus 4.8 <noreply@anthropic.com>
</commit_message>
<xml_diff>
--- a/docs/cadrage/personas.docx
+++ b/docs/cadrage/personas.docx
@@ -2,272 +2,60 @@
 <file path=word/document.xml><?xml version="1.0" encoding="utf-8"?>
 <w:document xmlns:wpc="http://schemas.microsoft.com/office/word/2010/wordprocessingCanvas" xmlns:mo="http://schemas.microsoft.com/office/mac/office/2008/main" xmlns:mc="http://schemas.openxmlformats.org/markup-compatibility/2006" xmlns:mv="urn:schemas-microsoft-com:mac:vml" xmlns:o="urn:schemas-microsoft-com:office:office" xmlns:r="http://schemas.openxmlformats.org/officeDocument/2006/relationships" xmlns:m="http://schemas.openxmlformats.org/officeDocument/2006/math" xmlns:v="urn:schemas-microsoft-com:vml" xmlns:wp14="http://schemas.microsoft.com/office/word/2010/wordprocessingDrawing" xmlns:wp="http://schemas.openxmlformats.org/drawingml/2006/wordprocessingDrawing" xmlns:w10="urn:schemas-microsoft-com:office:word" xmlns:w="http://schemas.openxmlformats.org/wordprocessingml/2006/main" xmlns:w14="http://schemas.microsoft.com/office/word/2010/wordml" xmlns:wpg="http://schemas.microsoft.com/office/word/2010/wordprocessingGroup" xmlns:wpi="http://schemas.microsoft.com/office/word/2010/wordprocessingInk" xmlns:wne="http://schemas.microsoft.com/office/word/2006/wordml" xmlns:wps="http://schemas.microsoft.com/office/word/2010/wordprocessingShape" mc:Ignorable="w14 wp14">
   <w:body>
+    <w:p/>
+    <w:p/>
+    <w:p/>
+    <w:p/>
     <w:p>
       <w:pPr>
-        <w:spacing w:after="40" w:before="1200"/>
         <w:jc w:val="center"/>
       </w:pPr>
       <w:r>
         <w:rPr>
           <w:b/>
-          <w:i w:val="0"/>
-          <w:color w:val="1F4E79"/>
+          <w:color w:val="4F46E5"/>
           <w:sz w:val="68"/>
-        </w:rPr>
-        <w:t>Personas</w:t>
-      </w:r>
-    </w:p>
-    <w:p>
-      <w:pPr>
-        <w:spacing w:after="360" w:before="0"/>
-        <w:jc w:val="center"/>
-      </w:pPr>
-      <w:r>
-        <w:rPr>
-          <w:b/>
-          <w:i w:val="0"/>
-          <w:color w:val="2E86C1"/>
-          <w:sz w:val="40"/>
         </w:rPr>
         <w:t>EduTutor IA</w:t>
       </w:r>
     </w:p>
     <w:p>
       <w:pPr>
-        <w:spacing w:after="600" w:before="0"/>
         <w:jc w:val="center"/>
       </w:pPr>
       <w:r>
         <w:rPr>
-          <w:b w:val="0"/>
-          <w:i/>
-          <w:color w:val="555555"/>
-          <w:sz w:val="24"/>
+          <w:color w:val="334155"/>
+          <w:sz w:val="32"/>
         </w:rPr>
-        <w:t>Assistant IA de révision — enseignant-first, génération ancrée dans les cours (RAG), 100 % local (Ollama, RGPD).</w:t>
+        <w:t>Cadrage produit</w:t>
       </w:r>
     </w:p>
-    <w:tbl>
-      <w:tblPr>
-        <w:tblW w:type="auto" w:w="0"/>
-        <w:jc w:val="center"/>
-        <w:tblLook w:firstColumn="1" w:firstRow="1" w:lastColumn="0" w:lastRow="0" w:noHBand="0" w:noVBand="1" w:val="04A0"/>
-        <w:tblBorders>
-          <w:top w:val="none"/>
-          <w:left w:val="none"/>
-          <w:bottom w:val="none"/>
-          <w:right w:val="none"/>
-          <w:insideH w:val="none"/>
-          <w:insideV w:val="none"/>
-        </w:tblBorders>
-      </w:tblPr>
-      <w:tblGrid>
-        <w:gridCol w:w="4320"/>
-        <w:gridCol w:w="4320"/>
-      </w:tblGrid>
-      <w:tr>
-        <w:tc>
-          <w:tcPr>
-            <w:tcW w:type="dxa" w:w="2268"/>
-            <w:shd w:val="clear" w:color="auto" w:fill="EAF2F8"/>
-            <w:tcMar>
-              <w:top w:w="80" w:type="dxa"/>
-              <w:bottom w:w="80" w:type="dxa"/>
-              <w:start w:w="120" w:type="dxa"/>
-              <w:end w:w="120" w:type="dxa"/>
-              <w:left w:w="120" w:type="dxa"/>
-              <w:right w:w="120" w:type="dxa"/>
-            </w:tcMar>
-          </w:tcPr>
-          <w:p>
-            <w:r>
-              <w:rPr>
-                <w:b/>
-                <w:color w:val="1F4E79"/>
-                <w:sz w:val="20"/>
-              </w:rPr>
-              <w:t>Projet</w:t>
-            </w:r>
-          </w:p>
-        </w:tc>
-        <w:tc>
-          <w:tcPr>
-            <w:tcW w:type="dxa" w:w="6803"/>
-            <w:tcMar>
-              <w:top w:w="80" w:type="dxa"/>
-              <w:bottom w:w="80" w:type="dxa"/>
-              <w:start w:w="120" w:type="dxa"/>
-              <w:end w:w="120" w:type="dxa"/>
-              <w:left w:w="120" w:type="dxa"/>
-              <w:right w:w="120" w:type="dxa"/>
-            </w:tcMar>
-          </w:tcPr>
-          <w:p>
-            <w:r>
-              <w:rPr>
-                <w:sz w:val="20"/>
-              </w:rPr>
-              <w:t>APOCAL'IPSSI 2026 — Reprise d'EduTutor IA</w:t>
-            </w:r>
-          </w:p>
-        </w:tc>
-      </w:tr>
-      <w:tr>
-        <w:tc>
-          <w:tcPr>
-            <w:tcW w:type="dxa" w:w="2268"/>
-            <w:shd w:val="clear" w:color="auto" w:fill="EAF2F8"/>
-            <w:tcMar>
-              <w:top w:w="80" w:type="dxa"/>
-              <w:bottom w:w="80" w:type="dxa"/>
-              <w:start w:w="120" w:type="dxa"/>
-              <w:end w:w="120" w:type="dxa"/>
-              <w:left w:w="120" w:type="dxa"/>
-              <w:right w:w="120" w:type="dxa"/>
-            </w:tcMar>
-          </w:tcPr>
-          <w:p>
-            <w:r>
-              <w:rPr>
-                <w:b/>
-                <w:color w:val="1F4E79"/>
-                <w:sz w:val="20"/>
-              </w:rPr>
-              <w:t>Artefact</w:t>
-            </w:r>
-          </w:p>
-        </w:tc>
-        <w:tc>
-          <w:tcPr>
-            <w:tcW w:type="dxa" w:w="6803"/>
-            <w:tcMar>
-              <w:top w:w="80" w:type="dxa"/>
-              <w:bottom w:w="80" w:type="dxa"/>
-              <w:start w:w="120" w:type="dxa"/>
-              <w:end w:w="120" w:type="dxa"/>
-              <w:left w:w="120" w:type="dxa"/>
-              <w:right w:w="120" w:type="dxa"/>
-            </w:tcMar>
-          </w:tcPr>
-          <w:p>
-            <w:r>
-              <w:rPr>
-                <w:sz w:val="20"/>
-              </w:rPr>
-              <w:t>Cadrage Jour 1 — Personas</w:t>
-            </w:r>
-          </w:p>
-        </w:tc>
-      </w:tr>
-      <w:tr>
-        <w:tc>
-          <w:tcPr>
-            <w:tcW w:type="dxa" w:w="2268"/>
-            <w:shd w:val="clear" w:color="auto" w:fill="EAF2F8"/>
-            <w:tcMar>
-              <w:top w:w="80" w:type="dxa"/>
-              <w:bottom w:w="80" w:type="dxa"/>
-              <w:start w:w="120" w:type="dxa"/>
-              <w:end w:w="120" w:type="dxa"/>
-              <w:left w:w="120" w:type="dxa"/>
-              <w:right w:w="120" w:type="dxa"/>
-            </w:tcMar>
-          </w:tcPr>
-          <w:p>
-            <w:r>
-              <w:rPr>
-                <w:b/>
-                <w:color w:val="1F4E79"/>
-                <w:sz w:val="20"/>
-              </w:rPr>
-              <w:t>Dépôt</w:t>
-            </w:r>
-          </w:p>
-        </w:tc>
-        <w:tc>
-          <w:tcPr>
-            <w:tcW w:type="dxa" w:w="6803"/>
-            <w:tcMar>
-              <w:top w:w="80" w:type="dxa"/>
-              <w:bottom w:w="80" w:type="dxa"/>
-              <w:start w:w="120" w:type="dxa"/>
-              <w:end w:w="120" w:type="dxa"/>
-              <w:left w:w="120" w:type="dxa"/>
-              <w:right w:w="120" w:type="dxa"/>
-            </w:tcMar>
-          </w:tcPr>
-          <w:p>
-            <w:r>
-              <w:rPr>
-                <w:sz w:val="20"/>
-              </w:rPr>
-              <w:t>fork public theohugo/IPSSI_APOCAL_KIT</w:t>
-            </w:r>
-          </w:p>
-        </w:tc>
-      </w:tr>
-      <w:tr>
-        <w:tc>
-          <w:tcPr>
-            <w:tcW w:type="dxa" w:w="2268"/>
-            <w:shd w:val="clear" w:color="auto" w:fill="EAF2F8"/>
-            <w:tcMar>
-              <w:top w:w="80" w:type="dxa"/>
-              <w:bottom w:w="80" w:type="dxa"/>
-              <w:start w:w="120" w:type="dxa"/>
-              <w:end w:w="120" w:type="dxa"/>
-              <w:left w:w="120" w:type="dxa"/>
-              <w:right w:w="120" w:type="dxa"/>
-            </w:tcMar>
-          </w:tcPr>
-          <w:p>
-            <w:r>
-              <w:rPr>
-                <w:b/>
-                <w:color w:val="1F4E79"/>
-                <w:sz w:val="20"/>
-              </w:rPr>
-              <w:t>Statut</w:t>
-            </w:r>
-          </w:p>
-        </w:tc>
-        <w:tc>
-          <w:tcPr>
-            <w:tcW w:type="dxa" w:w="6803"/>
-            <w:tcMar>
-              <w:top w:w="80" w:type="dxa"/>
-              <w:bottom w:w="80" w:type="dxa"/>
-              <w:start w:w="120" w:type="dxa"/>
-              <w:end w:w="120" w:type="dxa"/>
-              <w:left w:w="120" w:type="dxa"/>
-              <w:right w:w="120" w:type="dxa"/>
-            </w:tcMar>
-          </w:tcPr>
-          <w:p>
-            <w:r>
-              <w:rPr>
-                <w:sz w:val="20"/>
-              </w:rPr>
-              <w:t>À valider par le Product Owner</w:t>
-            </w:r>
-          </w:p>
-        </w:tc>
-      </w:tr>
-    </w:tbl>
     <w:p/>
     <w:p>
       <w:pPr>
-        <w:spacing w:after="80" w:before="0"/>
         <w:jc w:val="center"/>
       </w:pPr>
       <w:r>
         <w:rPr>
-          <w:b w:val="0"/>
+          <w:b/>
+          <w:sz w:val="44"/>
+        </w:rPr>
+        <w:t>Personas — EduTutor IA</w:t>
+      </w:r>
+    </w:p>
+    <w:p/>
+    <w:p/>
+    <w:p>
+      <w:pPr>
+        <w:jc w:val="center"/>
+      </w:pPr>
+      <w:r>
+        <w:rPr>
           <w:i/>
-          <w:color w:val="555555"/>
-          <w:sz w:val="18"/>
+          <w:color w:val="334155"/>
         </w:rPr>
-        <w:t>Document vivant — voir aussi le Product Backlog (docs/cadrage/product-backlog.md).</w:t>
+        <w:t>Livrable Jour 1 — APOCAL'IPSSI 2026</w:t>
       </w:r>
     </w:p>
     <w:p>
@@ -277,242 +65,249 @@
     </w:p>
     <w:p>
       <w:pPr>
-        <w:spacing w:after="120" w:before="80"/>
+        <w:ind w:left="454"/>
+      </w:pPr>
+      <w:r>
+        <w:t>Artefact de cadrage Jour 1 — APOCAL'IPSSI 2026</w:t>
+      </w:r>
+    </w:p>
+    <w:p>
+      <w:pPr>
+        <w:ind w:left="454"/>
+      </w:pPr>
+      <w:r>
+        <w:t xml:space="preserve">Produit : </w:t>
+      </w:r>
+      <w:r>
+        <w:rPr>
+          <w:b/>
+        </w:rPr>
+        <w:t>EduTutor IA</w:t>
+      </w:r>
+      <w:r>
+        <w:t xml:space="preserve"> — assistant IA de révision, </w:t>
+      </w:r>
+      <w:r>
+        <w:rPr>
+          <w:i/>
+        </w:rPr>
+        <w:t>enseignant-first</w:t>
+      </w:r>
+      <w:r>
+        <w:t>, génération ancrée dans les cours (RAG) et 100 % local (Ollama, RGPD).</w:t>
+      </w:r>
+    </w:p>
+    <w:p>
+      <w:pPr>
+        <w:ind w:left="454"/>
+      </w:pPr>
+      <w:r>
+        <w:t>Liens : Product Backlog · Perturbation J1 — Produit.</w:t>
+      </w:r>
+    </w:p>
+    <w:p>
+      <w:pPr>
+        <w:pStyle w:val="Heading1"/>
+      </w:pPr>
+      <w:r>
+        <w:t>1. Objet du document</w:t>
+      </w:r>
+    </w:p>
+    <w:p>
+      <w:r>
+        <w:t xml:space="preserve">Ce document décrit les </w:t>
+      </w:r>
+      <w:r>
+        <w:rPr>
+          <w:b/>
+        </w:rPr>
+        <w:t>utilisateurs cibles</w:t>
+      </w:r>
+      <w:r>
+        <w:t xml:space="preserve"> d'EduTutor IA afin d'orienter les décisions produit et la priorisation du backlog.</w:t>
+      </w:r>
+    </w:p>
+    <w:p>
+      <w:pPr>
+        <w:ind w:left="454"/>
       </w:pPr>
       <w:r>
         <w:rPr>
           <w:b/>
-          <w:i w:val="0"/>
-          <w:color w:val="1F4E79"/>
-          <w:sz w:val="30"/>
         </w:rPr>
-        <w:t>1. Objet du document</w:t>
+        <w:t>Mise à jour suite à la perturbation J1 (Produit).</w:t>
+      </w:r>
+      <w:r>
+        <w:t xml:space="preserve"> Le Product Owner a introduit la persona enseignante </w:t>
+      </w:r>
+      <w:r>
+        <w:rPr>
+          <w:b/>
+        </w:rPr>
+        <w:t>Mme Sophie Lefèvre</w:t>
+      </w:r>
+      <w:r>
+        <w:t xml:space="preserve"> et l'a positionnée comme </w:t>
+      </w:r>
+      <w:r>
+        <w:rPr>
+          <w:b/>
+        </w:rPr>
+        <w:t>cible principale, au même niveau que l'étudiant</w:t>
+      </w:r>
+      <w:r>
+        <w:t xml:space="preserve">. EduTutor IA sert désormais </w:t>
+      </w:r>
+      <w:r>
+        <w:rPr>
+          <w:b/>
+        </w:rPr>
+        <w:t>deux familles de personas primaires</w:t>
+      </w:r>
+      <w:r>
+        <w:t xml:space="preserve"> :</w:t>
       </w:r>
     </w:p>
     <w:p>
       <w:pPr>
-        <w:spacing w:after="160" w:before="0"/>
+        <w:ind w:left="454"/>
+      </w:pPr>
+    </w:p>
+    <w:p>
+      <w:pPr>
+        <w:ind w:left="454"/>
       </w:pPr>
       <w:r>
+        <w:t xml:space="preserve">- les </w:t>
+      </w:r>
+      <w:r>
         <w:rPr>
-          <w:b w:val="0"/>
-          <w:i w:val="0"/>
-          <w:color w:val="222222"/>
-          <w:sz w:val="21"/>
+          <w:b/>
         </w:rPr>
-        <w:t>Ce document décrit les utilisateurs cibles d'EduTutor IA afin d'orienter les décisions produit et la priorisation du backlog. Le positionnement est enseignant-first, mais la cible primaire d'usage sont les étudiants du supérieur qui révisent à partir de leurs cours (PDF/texte).</w:t>
+        <w:t>étudiants</w:t>
+      </w:r>
+      <w:r>
+        <w:t xml:space="preserve"> qui révisent à partir de leurs cours (usage quotidien) ;</w:t>
+      </w:r>
+    </w:p>
+    <w:p>
+      <w:pPr>
+        <w:ind w:left="454"/>
+      </w:pPr>
+      <w:r>
+        <w:t>- l'</w:t>
+      </w:r>
+      <w:r>
+        <w:rPr>
+          <w:b/>
+        </w:rPr>
+        <w:t>enseignante</w:t>
+      </w:r>
+      <w:r>
+        <w:t xml:space="preserve"> qui pilote la révision de sa classe (suivi, repérage, conseils).</w:t>
+      </w:r>
+    </w:p>
+    <w:p>
+      <w:pPr>
+        <w:ind w:left="454"/>
+      </w:pPr>
+    </w:p>
+    <w:p>
+      <w:pPr>
+        <w:ind w:left="454"/>
+      </w:pPr>
+      <w:r>
+        <w:t>Détail et décision : voir Perturbation J1 — Produit.</w:t>
+      </w:r>
+    </w:p>
+    <w:p>
+      <w:r>
+        <w:t>On distingue donc :</w:t>
       </w:r>
     </w:p>
     <w:p>
       <w:pPr>
         <w:pStyle w:val="ListBullet"/>
-        <w:spacing w:after="40"/>
       </w:pPr>
       <w:r>
         <w:rPr>
           <w:b/>
-          <w:color w:val="1F4E79"/>
-          <w:sz w:val="20"/>
         </w:rPr>
-        <w:t xml:space="preserve">Personas primaires — </w:t>
+        <w:t>Personas primaires</w:t>
+      </w:r>
+      <w:r>
+        <w:t xml:space="preserve"> — pilotent le MVP. Deux usages : l'étudiant qui révise (F1–F6) </w:t>
       </w:r>
       <w:r>
         <w:rPr>
-          <w:sz w:val="20"/>
+          <w:b/>
         </w:rPr>
-        <w:t>pilotent le MVP (F1–F6) : l'étudiant qui révise.</w:t>
+        <w:t>et</w:t>
+      </w:r>
+      <w:r>
+        <w:t xml:space="preserve"> l'enseignante qui suit sa classe (Espace enseignant).</w:t>
       </w:r>
     </w:p>
     <w:p>
       <w:pPr>
         <w:pStyle w:val="ListBullet"/>
-        <w:spacing w:after="40"/>
       </w:pPr>
       <w:r>
         <w:rPr>
           <w:b/>
-          <w:color w:val="1F4E79"/>
-          <w:sz w:val="20"/>
         </w:rPr>
-        <w:t xml:space="preserve">Persona secondaire — </w:t>
+        <w:t>Anti-persona</w:t>
+      </w:r>
+      <w:r>
+        <w:t xml:space="preserve"> — qui le produit </w:t>
       </w:r>
       <w:r>
         <w:rPr>
-          <w:sz w:val="20"/>
+          <w:b/>
         </w:rPr>
-        <w:t>porte la vision teacher-first et les pistes Release 2.</w:t>
+        <w:t>ne</w:t>
+      </w:r>
+      <w:r>
+        <w:t xml:space="preserve"> vise </w:t>
+      </w:r>
+      <w:r>
+        <w:rPr>
+          <w:b/>
+        </w:rPr>
+        <w:t>pas</w:t>
+      </w:r>
+      <w:r>
+        <w:t>, pour cadrer le périmètre.</w:t>
+      </w:r>
+    </w:p>
+    <w:p>
+      <w:r>
+        <w:t xml:space="preserve">Chaque persona indique les </w:t>
+      </w:r>
+      <w:r>
+        <w:rPr>
+          <w:b/>
+        </w:rPr>
+        <w:t>user stories</w:t>
+      </w:r>
+      <w:r>
+        <w:t xml:space="preserve"> qu'il justifie (traçabilité avec le backlog).</w:t>
       </w:r>
     </w:p>
     <w:p>
       <w:pPr>
-        <w:pStyle w:val="ListBullet"/>
-        <w:spacing w:after="40"/>
+        <w:pStyle w:val="Heading1"/>
       </w:pPr>
       <w:r>
-        <w:rPr>
-          <w:b/>
-          <w:color w:val="1F4E79"/>
-          <w:sz w:val="20"/>
-        </w:rPr>
-        <w:t xml:space="preserve">Anti-persona — </w:t>
-      </w:r>
-      <w:r>
-        <w:rPr>
-          <w:sz w:val="20"/>
-        </w:rPr>
-        <w:t>qui le produit ne vise pas, pour cadrer le périmètre.</w:t>
-      </w:r>
-    </w:p>
-    <w:p>
-      <w:pPr>
-        <w:spacing w:after="200" w:before="80"/>
-      </w:pPr>
-      <w:r>
-        <w:rPr>
-          <w:b w:val="0"/>
-          <w:i w:val="0"/>
-          <w:color w:val="222222"/>
-          <w:sz w:val="21"/>
-        </w:rPr>
-        <w:t>Chaque persona indique les user stories qu'il justifie (traçabilité avec le backlog).</w:t>
+        <w:t>2. Persona primaire #1 — Léa, l'étudiante qui révise dans l'urgence</w:t>
       </w:r>
     </w:p>
     <w:tbl>
       <w:tblPr>
+        <w:tblStyle w:val="LightGrid-Accent1"/>
         <w:tblW w:type="auto" w:w="0"/>
+        <w:jc w:val="center"/>
         <w:tblLook w:firstColumn="1" w:firstRow="1" w:lastColumn="0" w:lastRow="0" w:noHBand="0" w:noVBand="1" w:val="04A0"/>
-        <w:tblBorders>
-          <w:top w:val="none"/>
-          <w:left w:val="none"/>
-          <w:bottom w:val="none"/>
-          <w:right w:val="none"/>
-          <w:insideH w:val="none"/>
-          <w:insideV w:val="none"/>
-        </w:tblBorders>
-      </w:tblPr>
-      <w:tblGrid>
-        <w:gridCol w:w="2041"/>
-        <w:gridCol w:w="7030"/>
-      </w:tblGrid>
-      <w:tr>
-        <w:tc>
-          <w:tcPr>
-            <w:tcW w:type="dxa" w:w="2041"/>
-            <w:shd w:val="clear" w:color="auto" w:fill="F4F8FB"/>
-            <w:tcMar>
-              <w:top w:w="120" w:type="dxa"/>
-              <w:bottom w:w="120" w:type="dxa"/>
-              <w:start w:w="120" w:type="dxa"/>
-              <w:end w:w="120" w:type="dxa"/>
-              <w:left w:w="120" w:type="dxa"/>
-              <w:right w:w="120" w:type="dxa"/>
-            </w:tcMar>
-          </w:tcPr>
-          <w:p>
-            <w:pPr>
-              <w:jc w:val="center"/>
-            </w:pPr>
-            <w:r>
-              <w:drawing>
-                <wp:inline xmlns:a="http://schemas.openxmlformats.org/drawingml/2006/main" xmlns:pic="http://schemas.openxmlformats.org/drawingml/2006/picture">
-                  <wp:extent cx="1044000" cy="1044000"/>
-                  <wp:docPr id="1" name="Picture 1"/>
-                  <wp:cNvGraphicFramePr>
-                    <a:graphicFrameLocks noChangeAspect="1"/>
-                  </wp:cNvGraphicFramePr>
-                  <a:graphic>
-                    <a:graphicData uri="http://schemas.openxmlformats.org/drawingml/2006/picture">
-                      <pic:pic>
-                        <pic:nvPicPr>
-                          <pic:cNvPr id="0" name="lea.jpg"/>
-                          <pic:cNvPicPr/>
-                        </pic:nvPicPr>
-                        <pic:blipFill>
-                          <a:blip r:embed="rId9"/>
-                          <a:stretch>
-                            <a:fillRect/>
-                          </a:stretch>
-                        </pic:blipFill>
-                        <pic:spPr>
-                          <a:xfrm>
-                            <a:off x="0" y="0"/>
-                            <a:ext cx="1044000" cy="1044000"/>
-                          </a:xfrm>
-                          <a:prstGeom prst="rect"/>
-                        </pic:spPr>
-                      </pic:pic>
-                    </a:graphicData>
-                  </a:graphic>
-                </wp:inline>
-              </w:drawing>
-            </w:r>
-          </w:p>
-        </w:tc>
-        <w:tc>
-          <w:tcPr>
-            <w:tcW w:type="dxa" w:w="7030"/>
-            <w:shd w:val="clear" w:color="auto" w:fill="F4F8FB"/>
-            <w:tcMar>
-              <w:top w:w="120" w:type="dxa"/>
-              <w:bottom w:w="120" w:type="dxa"/>
-              <w:start w:w="160" w:type="dxa"/>
-              <w:end w:w="160" w:type="dxa"/>
-              <w:left w:w="160" w:type="dxa"/>
-              <w:right w:w="160" w:type="dxa"/>
-            </w:tcMar>
-          </w:tcPr>
-          <w:p>
-            <w:r>
-              <w:rPr>
-                <w:b/>
-                <w:color w:val="1F4E79"/>
-                <w:sz w:val="32"/>
-              </w:rPr>
-              <w:t>2. Léa — l'étudiante qui révise dans l'urgence</w:t>
-            </w:r>
-          </w:p>
-          <w:p>
-            <w:pPr>
-              <w:spacing w:after="80"/>
-            </w:pPr>
-            <w:r>
-              <w:rPr>
-                <w:b/>
-                <w:color w:val="FFFFFF"/>
-                <w:sz w:val="18"/>
-                <w:shd w:val="clear" w:fill="C0392B"/>
-              </w:rPr>
-              <w:t xml:space="preserve">  PERSONA PRIMAIRE  </w:t>
-            </w:r>
-          </w:p>
-          <w:p>
-            <w:pPr>
-              <w:spacing w:before="40"/>
-            </w:pPr>
-            <w:r>
-              <w:rPr>
-                <w:i/>
-                <w:color w:val="2E86C1"/>
-                <w:sz w:val="21"/>
-              </w:rPr>
-              <w:t>« J'ai 60 pages à réviser ce soir, je veux juste savoir si j'ai compris. »</w:t>
-            </w:r>
-          </w:p>
-        </w:tc>
-      </w:tr>
-    </w:tbl>
-    <w:tbl>
-      <w:tblPr>
-        <w:tblW w:type="auto" w:w="0"/>
-        <w:tblLook w:firstColumn="1" w:firstRow="1" w:lastColumn="0" w:lastRow="0" w:noHBand="0" w:noVBand="1" w:val="04A0"/>
-        <w:tblBorders>
-          <w:top w:val="none"/>
-          <w:left w:val="none"/>
-          <w:bottom w:val="none"/>
-          <w:right w:val="none"/>
-          <w:insideH w:val="none"/>
-          <w:insideV w:val="none"/>
-        </w:tblBorders>
       </w:tblPr>
       <w:tblGrid>
         <w:gridCol w:w="4320"/>
@@ -521,23 +316,41 @@
       <w:tr>
         <w:tc>
           <w:tcPr>
-            <w:tcW w:type="dxa" w:w="2381"/>
-            <w:shd w:val="clear" w:color="auto" w:fill="EAF2F8"/>
-            <w:tcMar>
-              <w:top w:w="80" w:type="dxa"/>
-              <w:bottom w:w="80" w:type="dxa"/>
-              <w:start w:w="120" w:type="dxa"/>
-              <w:end w:w="120" w:type="dxa"/>
-              <w:left w:w="120" w:type="dxa"/>
-              <w:right w:w="120" w:type="dxa"/>
-            </w:tcMar>
+            <w:tcW w:type="dxa" w:w="4320"/>
           </w:tcPr>
           <w:p>
+            <w:r/>
             <w:r>
               <w:rPr>
                 <w:b/>
-                <w:color w:val="1F4E79"/>
-                <w:sz w:val="19"/>
+              </w:rPr>
+            </w:r>
+          </w:p>
+        </w:tc>
+        <w:tc>
+          <w:tcPr>
+            <w:tcW w:type="dxa" w:w="4320"/>
+          </w:tcPr>
+          <w:p>
+            <w:r/>
+            <w:r>
+              <w:rPr>
+                <w:b/>
+              </w:rPr>
+            </w:r>
+          </w:p>
+        </w:tc>
+      </w:tr>
+      <w:tr>
+        <w:tc>
+          <w:tcPr>
+            <w:tcW w:type="dxa" w:w="4320"/>
+          </w:tcPr>
+          <w:p>
+            <w:r/>
+            <w:r>
+              <w:rPr>
+                <w:b/>
               </w:rPr>
               <w:t>Âge / situation</w:t>
             </w:r>
@@ -545,21 +358,11 @@
         </w:tc>
         <w:tc>
           <w:tcPr>
-            <w:tcW w:type="dxa" w:w="6690"/>
-            <w:tcMar>
-              <w:top w:w="80" w:type="dxa"/>
-              <w:bottom w:w="80" w:type="dxa"/>
-              <w:start w:w="120" w:type="dxa"/>
-              <w:end w:w="120" w:type="dxa"/>
-              <w:left w:w="120" w:type="dxa"/>
-              <w:right w:w="120" w:type="dxa"/>
-            </w:tcMar>
+            <w:tcW w:type="dxa" w:w="4320"/>
           </w:tcPr>
           <w:p>
+            <w:r/>
             <w:r>
-              <w:rPr>
-                <w:sz w:val="19"/>
-              </w:rPr>
               <w:t>20 ans, étudiante en L2 Droit</w:t>
             </w:r>
           </w:p>
@@ -568,23 +371,13 @@
       <w:tr>
         <w:tc>
           <w:tcPr>
-            <w:tcW w:type="dxa" w:w="2381"/>
-            <w:shd w:val="clear" w:color="auto" w:fill="EAF2F8"/>
-            <w:tcMar>
-              <w:top w:w="80" w:type="dxa"/>
-              <w:bottom w:w="80" w:type="dxa"/>
-              <w:start w:w="120" w:type="dxa"/>
-              <w:end w:w="120" w:type="dxa"/>
-              <w:left w:w="120" w:type="dxa"/>
-              <w:right w:w="120" w:type="dxa"/>
-            </w:tcMar>
+            <w:tcW w:type="dxa" w:w="4320"/>
           </w:tcPr>
           <w:p>
+            <w:r/>
             <w:r>
               <w:rPr>
                 <w:b/>
-                <w:color w:val="1F4E79"/>
-                <w:sz w:val="19"/>
               </w:rPr>
               <w:t>Aisance numérique</w:t>
             </w:r>
@@ -592,21 +385,11 @@
         </w:tc>
         <w:tc>
           <w:tcPr>
-            <w:tcW w:type="dxa" w:w="6690"/>
-            <w:tcMar>
-              <w:top w:w="80" w:type="dxa"/>
-              <w:bottom w:w="80" w:type="dxa"/>
-              <w:start w:w="120" w:type="dxa"/>
-              <w:end w:w="120" w:type="dxa"/>
-              <w:left w:w="120" w:type="dxa"/>
-              <w:right w:w="120" w:type="dxa"/>
-            </w:tcMar>
+            <w:tcW w:type="dxa" w:w="4320"/>
           </w:tcPr>
           <w:p>
+            <w:r/>
             <w:r>
-              <w:rPr>
-                <w:sz w:val="19"/>
-              </w:rPr>
               <w:t>Élevée (mobile-first), peu patiente face aux outils complexes</w:t>
             </w:r>
           </w:p>
@@ -615,23 +398,13 @@
       <w:tr>
         <w:tc>
           <w:tcPr>
-            <w:tcW w:type="dxa" w:w="2381"/>
-            <w:shd w:val="clear" w:color="auto" w:fill="EAF2F8"/>
-            <w:tcMar>
-              <w:top w:w="80" w:type="dxa"/>
-              <w:bottom w:w="80" w:type="dxa"/>
-              <w:start w:w="120" w:type="dxa"/>
-              <w:end w:w="120" w:type="dxa"/>
-              <w:left w:w="120" w:type="dxa"/>
-              <w:right w:w="120" w:type="dxa"/>
-            </w:tcMar>
+            <w:tcW w:type="dxa" w:w="4320"/>
           </w:tcPr>
           <w:p>
+            <w:r/>
             <w:r>
               <w:rPr>
                 <w:b/>
-                <w:color w:val="1F4E79"/>
-                <w:sz w:val="19"/>
               </w:rPr>
               <w:t>Contexte</w:t>
             </w:r>
@@ -639,233 +412,39 @@
         </w:tc>
         <w:tc>
           <w:tcPr>
-            <w:tcW w:type="dxa" w:w="6690"/>
-            <w:tcMar>
-              <w:top w:w="80" w:type="dxa"/>
-              <w:bottom w:w="80" w:type="dxa"/>
-              <w:start w:w="120" w:type="dxa"/>
-              <w:end w:w="120" w:type="dxa"/>
-              <w:left w:w="120" w:type="dxa"/>
-              <w:right w:w="120" w:type="dxa"/>
-            </w:tcMar>
+            <w:tcW w:type="dxa" w:w="4320"/>
           </w:tcPr>
           <w:p>
+            <w:r/>
             <w:r>
-              <w:rPr>
-                <w:sz w:val="19"/>
-              </w:rPr>
-              <w:t>Révise le soir et la veille des partiels, à partir de PDF de cours</w:t>
+              <w:t>Révise surtout le soir et la veille des partiels, à partir de PDF de cours</w:t>
             </w:r>
           </w:p>
         </w:tc>
       </w:tr>
-    </w:tbl>
-    <w:p>
-      <w:pPr>
-        <w:spacing w:after="40" w:before="160"/>
-      </w:pPr>
-      <w:r>
-        <w:rPr>
-          <w:b/>
-          <w:i w:val="0"/>
-          <w:color w:val="2E86C1"/>
-          <w:sz w:val="22"/>
-        </w:rPr>
-        <w:t>Objectifs</w:t>
-      </w:r>
-    </w:p>
-    <w:p>
-      <w:pPr>
-        <w:pStyle w:val="ListBullet"/>
-        <w:spacing w:after="40"/>
-      </w:pPr>
-      <w:r>
-        <w:rPr>
-          <w:sz w:val="20"/>
-        </w:rPr>
-        <w:t>Transformer rapidement un cours (PDF/texte) en quiz pour s'auto-évaluer.</w:t>
-      </w:r>
-    </w:p>
-    <w:p>
-      <w:pPr>
-        <w:pStyle w:val="ListBullet"/>
-        <w:spacing w:after="40"/>
-      </w:pPr>
-      <w:r>
-        <w:rPr>
-          <w:sz w:val="20"/>
-        </w:rPr>
-        <w:t>Identifier ses points faibles avant l'examen.</w:t>
-      </w:r>
-    </w:p>
-    <w:p>
-      <w:pPr>
-        <w:pStyle w:val="ListBullet"/>
-        <w:spacing w:after="40"/>
-      </w:pPr>
-      <w:r>
-        <w:rPr>
-          <w:sz w:val="20"/>
-        </w:rPr>
-        <w:t>Suivre sa progression d'une session à l'autre.</w:t>
-      </w:r>
-    </w:p>
-    <w:p>
-      <w:pPr>
-        <w:spacing w:after="40" w:before="120"/>
-      </w:pPr>
-      <w:r>
-        <w:rPr>
-          <w:b/>
-          <w:i w:val="0"/>
-          <w:color w:val="2E86C1"/>
-          <w:sz w:val="22"/>
-        </w:rPr>
-        <w:t>Frustrations</w:t>
-      </w:r>
-    </w:p>
-    <w:p>
-      <w:pPr>
-        <w:pStyle w:val="ListBullet"/>
-        <w:spacing w:after="40"/>
-      </w:pPr>
-      <w:r>
-        <w:rPr>
-          <w:sz w:val="20"/>
-        </w:rPr>
-        <w:t>Relire passivement sans savoir ce qui est acquis.</w:t>
-      </w:r>
-    </w:p>
-    <w:p>
-      <w:pPr>
-        <w:pStyle w:val="ListBullet"/>
-        <w:spacing w:after="40"/>
-      </w:pPr>
-      <w:r>
-        <w:rPr>
-          <w:sz w:val="20"/>
-        </w:rPr>
-        <w:t>Outils de révision génériques, déconnectés de ses cours.</w:t>
-      </w:r>
-    </w:p>
-    <w:p>
-      <w:pPr>
-        <w:pStyle w:val="ListBullet"/>
-        <w:spacing w:after="40"/>
-      </w:pPr>
-      <w:r>
-        <w:rPr>
-          <w:sz w:val="20"/>
-        </w:rPr>
-        <w:t>Saisir manuellement des fiches/QCM : trop long.</w:t>
-      </w:r>
-    </w:p>
-    <w:p>
-      <w:pPr>
-        <w:spacing w:after="40" w:before="120"/>
-      </w:pPr>
-      <w:r>
-        <w:rPr>
-          <w:b/>
-          <w:i w:val="0"/>
-          <w:color w:val="2E86C1"/>
-          <w:sz w:val="22"/>
-        </w:rPr>
-        <w:t>Besoins → User stories</w:t>
-      </w:r>
-    </w:p>
-    <w:p>
-      <w:pPr>
-        <w:pStyle w:val="ListBullet"/>
-        <w:spacing w:after="40"/>
-      </w:pPr>
-      <w:r>
-        <w:rPr>
-          <w:sz w:val="20"/>
-        </w:rPr>
-        <w:t>Upload PDF / coller du texte  → US-F2.1, US-F2.2</w:t>
-      </w:r>
-    </w:p>
-    <w:p>
-      <w:pPr>
-        <w:pStyle w:val="ListBullet"/>
-        <w:spacing w:after="40"/>
-      </w:pPr>
-      <w:r>
-        <w:rPr>
-          <w:sz w:val="20"/>
-        </w:rPr>
-        <w:t>Générer 10 QCM ancrés dans le cours  → US-F3.1</w:t>
-      </w:r>
-    </w:p>
-    <w:p>
-      <w:pPr>
-        <w:pStyle w:val="ListBullet"/>
-        <w:spacing w:after="40"/>
-      </w:pPr>
-      <w:r>
-        <w:rPr>
-          <w:sz w:val="20"/>
-        </w:rPr>
-        <w:t>Score /10 + détail des erreurs  → US-F5.1, US-F5.2</w:t>
-      </w:r>
-    </w:p>
-    <w:p>
-      <w:pPr>
-        <w:pStyle w:val="ListBullet"/>
-        <w:spacing w:after="40"/>
-      </w:pPr>
-      <w:r>
-        <w:rPr>
-          <w:sz w:val="20"/>
-        </w:rPr>
-        <w:t>Retrouver l'historique de ses quiz  → US-F6.1</w:t>
-      </w:r>
-    </w:p>
-    <w:tbl>
-      <w:tblPr>
-        <w:tblW w:type="auto" w:w="0"/>
-        <w:tblLook w:firstColumn="1" w:firstRow="1" w:lastColumn="0" w:lastRow="0" w:noHBand="0" w:noVBand="1" w:val="04A0"/>
-        <w:tblBorders>
-          <w:top w:val="none"/>
-          <w:left w:val="none"/>
-          <w:bottom w:val="none"/>
-          <w:right w:val="none"/>
-          <w:insideH w:val="none"/>
-          <w:insideV w:val="none"/>
-        </w:tblBorders>
-      </w:tblPr>
-      <w:tblGrid>
-        <w:gridCol w:w="8640"/>
-      </w:tblGrid>
       <w:tr>
         <w:tc>
           <w:tcPr>
-            <w:tcW w:type="dxa" w:w="8640"/>
-            <w:shd w:val="clear" w:color="auto" w:fill="FFF6E5"/>
-            <w:tcMar>
-              <w:top w:w="120" w:type="dxa"/>
-              <w:bottom w:w="120" w:type="dxa"/>
-              <w:start w:w="160" w:type="dxa"/>
-              <w:end w:w="160" w:type="dxa"/>
-              <w:left w:w="160" w:type="dxa"/>
-              <w:right w:w="160" w:type="dxa"/>
-            </w:tcMar>
+            <w:tcW w:type="dxa" w:w="4320"/>
           </w:tcPr>
           <w:p>
+            <w:r/>
             <w:r>
               <w:rPr>
                 <w:b/>
-                <w:color w:val="B9770E"/>
-                <w:sz w:val="19"/>
               </w:rPr>
-              <w:t xml:space="preserve">Scénario type  </w:t>
+              <w:t>Citation</w:t>
             </w:r>
+          </w:p>
+        </w:tc>
+        <w:tc>
+          <w:tcPr>
+            <w:tcW w:type="dxa" w:w="4320"/>
+          </w:tcPr>
+          <w:p>
+            <w:r/>
             <w:r>
-              <w:rPr>
-                <w:sz w:val="19"/>
-              </w:rPr>
-              <w:t>Léa téléverse le PDF du chapitre, lance la génération, répond aux 10 QCM dans le métro, obtient 6/10 et voit les 4 questions ratées → elle sait quoi revoir.</w:t>
+              <w:t>« J'ai 60 pages à réviser ce soir, je veux juste savoir si j'ai compris. »</w:t>
             </w:r>
           </w:p>
         </w:tc>
@@ -874,145 +453,175 @@
     <w:p/>
     <w:p>
       <w:r>
-        <w:br w:type="page"/>
+        <w:rPr>
+          <w:b/>
+        </w:rPr>
+        <w:t>Objectifs</w:t>
+      </w:r>
+    </w:p>
+    <w:p>
+      <w:pPr>
+        <w:pStyle w:val="ListBullet"/>
+      </w:pPr>
+      <w:r>
+        <w:t>Transformer rapidement un cours (PDF/texte) en quiz pour s'auto-évaluer.</w:t>
+      </w:r>
+    </w:p>
+    <w:p>
+      <w:pPr>
+        <w:pStyle w:val="ListBullet"/>
+      </w:pPr>
+      <w:r>
+        <w:t xml:space="preserve">Identifier ses points faibles </w:t>
+      </w:r>
+      <w:r>
+        <w:rPr>
+          <w:b/>
+        </w:rPr>
+        <w:t>avant</w:t>
+      </w:r>
+      <w:r>
+        <w:t xml:space="preserve"> l'examen.</w:t>
+      </w:r>
+    </w:p>
+    <w:p>
+      <w:pPr>
+        <w:pStyle w:val="ListBullet"/>
+      </w:pPr>
+      <w:r>
+        <w:t>Suivre sa progression d'une session à l'autre.</w:t>
+      </w:r>
+    </w:p>
+    <w:p>
+      <w:r>
+        <w:rPr>
+          <w:b/>
+        </w:rPr>
+        <w:t>Frustrations</w:t>
+      </w:r>
+    </w:p>
+    <w:p>
+      <w:pPr>
+        <w:pStyle w:val="ListBullet"/>
+      </w:pPr>
+      <w:r>
+        <w:t>Relire passivement sans savoir ce qui est acquis.</w:t>
+      </w:r>
+    </w:p>
+    <w:p>
+      <w:pPr>
+        <w:pStyle w:val="ListBullet"/>
+      </w:pPr>
+      <w:r>
+        <w:t xml:space="preserve">Outils de révision génériques, déconnectés de </w:t>
+      </w:r>
+      <w:r>
+        <w:rPr>
+          <w:b/>
+        </w:rPr>
+        <w:t>ses</w:t>
+      </w:r>
+      <w:r>
+        <w:t xml:space="preserve"> cours.</w:t>
+      </w:r>
+    </w:p>
+    <w:p>
+      <w:pPr>
+        <w:pStyle w:val="ListBullet"/>
+      </w:pPr>
+      <w:r>
+        <w:t>Saisir manuellement des fiches/QCM : trop long.</w:t>
+      </w:r>
+    </w:p>
+    <w:p>
+      <w:r>
+        <w:rPr>
+          <w:b/>
+        </w:rPr>
+        <w:t>Besoins → User stories</w:t>
+      </w:r>
+    </w:p>
+    <w:p>
+      <w:pPr>
+        <w:pStyle w:val="ListBullet"/>
+      </w:pPr>
+      <w:r>
+        <w:t xml:space="preserve">Upload PDF / coller du texte → </w:t>
+      </w:r>
+      <w:r>
+        <w:rPr>
+          <w:b/>
+        </w:rPr>
+        <w:t>US-F2.1, US-F2.2</w:t>
+      </w:r>
+    </w:p>
+    <w:p>
+      <w:pPr>
+        <w:pStyle w:val="ListBullet"/>
+      </w:pPr>
+      <w:r>
+        <w:t xml:space="preserve">Générer 10 QCM ancrés dans le cours → </w:t>
+      </w:r>
+      <w:r>
+        <w:rPr>
+          <w:b/>
+        </w:rPr>
+        <w:t>US-F3.1</w:t>
+      </w:r>
+    </w:p>
+    <w:p>
+      <w:pPr>
+        <w:pStyle w:val="ListBullet"/>
+      </w:pPr>
+      <w:r>
+        <w:t xml:space="preserve">Voir un score /10 + le détail des erreurs → </w:t>
+      </w:r>
+      <w:r>
+        <w:rPr>
+          <w:b/>
+        </w:rPr>
+        <w:t>US-F5.1, US-F5.2</w:t>
+      </w:r>
+    </w:p>
+    <w:p>
+      <w:pPr>
+        <w:pStyle w:val="ListBullet"/>
+      </w:pPr>
+      <w:r>
+        <w:t xml:space="preserve">Retrouver l'historique de ses quiz → </w:t>
+      </w:r>
+      <w:r>
+        <w:rPr>
+          <w:b/>
+        </w:rPr>
+        <w:t>US-F6.1</w:t>
+      </w:r>
+    </w:p>
+    <w:p>
+      <w:r>
+        <w:rPr>
+          <w:b/>
+        </w:rPr>
+        <w:t>Scénario type</w:t>
+      </w:r>
+      <w:r>
+        <w:t xml:space="preserve"> : Léa téléverse le PDF du chapitre, lance la génération, répond aux 10 QCM dans le métro, obtient 6/10 et voit les 4 questions ratées → elle sait quoi revoir.</w:t>
+      </w:r>
+    </w:p>
+    <w:p>
+      <w:pPr>
+        <w:pStyle w:val="Heading1"/>
+      </w:pPr>
+      <w:r>
+        <w:t>3. Persona primaire #2 — Karim, l'étudiant méthodique en reconversion</w:t>
       </w:r>
     </w:p>
     <w:tbl>
       <w:tblPr>
+        <w:tblStyle w:val="LightGrid-Accent1"/>
         <w:tblW w:type="auto" w:w="0"/>
+        <w:jc w:val="center"/>
         <w:tblLook w:firstColumn="1" w:firstRow="1" w:lastColumn="0" w:lastRow="0" w:noHBand="0" w:noVBand="1" w:val="04A0"/>
-        <w:tblBorders>
-          <w:top w:val="none"/>
-          <w:left w:val="none"/>
-          <w:bottom w:val="none"/>
-          <w:right w:val="none"/>
-          <w:insideH w:val="none"/>
-          <w:insideV w:val="none"/>
-        </w:tblBorders>
-      </w:tblPr>
-      <w:tblGrid>
-        <w:gridCol w:w="2041"/>
-        <w:gridCol w:w="7030"/>
-      </w:tblGrid>
-      <w:tr>
-        <w:tc>
-          <w:tcPr>
-            <w:tcW w:type="dxa" w:w="2041"/>
-            <w:shd w:val="clear" w:color="auto" w:fill="F4F8FB"/>
-            <w:tcMar>
-              <w:top w:w="120" w:type="dxa"/>
-              <w:bottom w:w="120" w:type="dxa"/>
-              <w:start w:w="120" w:type="dxa"/>
-              <w:end w:w="120" w:type="dxa"/>
-              <w:left w:w="120" w:type="dxa"/>
-              <w:right w:w="120" w:type="dxa"/>
-            </w:tcMar>
-          </w:tcPr>
-          <w:p>
-            <w:pPr>
-              <w:jc w:val="center"/>
-            </w:pPr>
-            <w:r>
-              <w:drawing>
-                <wp:inline xmlns:a="http://schemas.openxmlformats.org/drawingml/2006/main" xmlns:pic="http://schemas.openxmlformats.org/drawingml/2006/picture">
-                  <wp:extent cx="1044000" cy="1044000"/>
-                  <wp:docPr id="2" name="Picture 2"/>
-                  <wp:cNvGraphicFramePr>
-                    <a:graphicFrameLocks noChangeAspect="1"/>
-                  </wp:cNvGraphicFramePr>
-                  <a:graphic>
-                    <a:graphicData uri="http://schemas.openxmlformats.org/drawingml/2006/picture">
-                      <pic:pic>
-                        <pic:nvPicPr>
-                          <pic:cNvPr id="0" name="karim.jpg"/>
-                          <pic:cNvPicPr/>
-                        </pic:nvPicPr>
-                        <pic:blipFill>
-                          <a:blip r:embed="rId10"/>
-                          <a:stretch>
-                            <a:fillRect/>
-                          </a:stretch>
-                        </pic:blipFill>
-                        <pic:spPr>
-                          <a:xfrm>
-                            <a:off x="0" y="0"/>
-                            <a:ext cx="1044000" cy="1044000"/>
-                          </a:xfrm>
-                          <a:prstGeom prst="rect"/>
-                        </pic:spPr>
-                      </pic:pic>
-                    </a:graphicData>
-                  </a:graphic>
-                </wp:inline>
-              </w:drawing>
-            </w:r>
-          </w:p>
-        </w:tc>
-        <w:tc>
-          <w:tcPr>
-            <w:tcW w:type="dxa" w:w="7030"/>
-            <w:shd w:val="clear" w:color="auto" w:fill="F4F8FB"/>
-            <w:tcMar>
-              <w:top w:w="120" w:type="dxa"/>
-              <w:bottom w:w="120" w:type="dxa"/>
-              <w:start w:w="160" w:type="dxa"/>
-              <w:end w:w="160" w:type="dxa"/>
-              <w:left w:w="160" w:type="dxa"/>
-              <w:right w:w="160" w:type="dxa"/>
-            </w:tcMar>
-          </w:tcPr>
-          <w:p>
-            <w:r>
-              <w:rPr>
-                <w:b/>
-                <w:color w:val="1F4E79"/>
-                <w:sz w:val="32"/>
-              </w:rPr>
-              <w:t>3. Karim — l'étudiant méthodique en reconversion</w:t>
-            </w:r>
-          </w:p>
-          <w:p>
-            <w:pPr>
-              <w:spacing w:after="80"/>
-            </w:pPr>
-            <w:r>
-              <w:rPr>
-                <w:b/>
-                <w:color w:val="FFFFFF"/>
-                <w:sz w:val="18"/>
-                <w:shd w:val="clear" w:fill="C0392B"/>
-              </w:rPr>
-              <w:t xml:space="preserve">  PERSONA PRIMAIRE  </w:t>
-            </w:r>
-          </w:p>
-          <w:p>
-            <w:pPr>
-              <w:spacing w:before="40"/>
-            </w:pPr>
-            <w:r>
-              <w:rPr>
-                <w:i/>
-                <w:color w:val="2E86C1"/>
-                <w:sz w:val="21"/>
-              </w:rPr>
-              <w:t>« Je veux progresser dans la durée, pas bachoter — et savoir où vont mes données. »</w:t>
-            </w:r>
-          </w:p>
-        </w:tc>
-      </w:tr>
-    </w:tbl>
-    <w:tbl>
-      <w:tblPr>
-        <w:tblW w:type="auto" w:w="0"/>
-        <w:tblLook w:firstColumn="1" w:firstRow="1" w:lastColumn="0" w:lastRow="0" w:noHBand="0" w:noVBand="1" w:val="04A0"/>
-        <w:tblBorders>
-          <w:top w:val="none"/>
-          <w:left w:val="none"/>
-          <w:bottom w:val="none"/>
-          <w:right w:val="none"/>
-          <w:insideH w:val="none"/>
-          <w:insideV w:val="none"/>
-        </w:tblBorders>
       </w:tblPr>
       <w:tblGrid>
         <w:gridCol w:w="4320"/>
@@ -1021,23 +630,41 @@
       <w:tr>
         <w:tc>
           <w:tcPr>
-            <w:tcW w:type="dxa" w:w="2381"/>
-            <w:shd w:val="clear" w:color="auto" w:fill="EAF2F8"/>
-            <w:tcMar>
-              <w:top w:w="80" w:type="dxa"/>
-              <w:bottom w:w="80" w:type="dxa"/>
-              <w:start w:w="120" w:type="dxa"/>
-              <w:end w:w="120" w:type="dxa"/>
-              <w:left w:w="120" w:type="dxa"/>
-              <w:right w:w="120" w:type="dxa"/>
-            </w:tcMar>
+            <w:tcW w:type="dxa" w:w="4320"/>
           </w:tcPr>
           <w:p>
+            <w:r/>
             <w:r>
               <w:rPr>
                 <w:b/>
-                <w:color w:val="1F4E79"/>
-                <w:sz w:val="19"/>
+              </w:rPr>
+            </w:r>
+          </w:p>
+        </w:tc>
+        <w:tc>
+          <w:tcPr>
+            <w:tcW w:type="dxa" w:w="4320"/>
+          </w:tcPr>
+          <w:p>
+            <w:r/>
+            <w:r>
+              <w:rPr>
+                <w:b/>
+              </w:rPr>
+            </w:r>
+          </w:p>
+        </w:tc>
+      </w:tr>
+      <w:tr>
+        <w:tc>
+          <w:tcPr>
+            <w:tcW w:type="dxa" w:w="4320"/>
+          </w:tcPr>
+          <w:p>
+            <w:r/>
+            <w:r>
+              <w:rPr>
+                <w:b/>
               </w:rPr>
               <w:t>Âge / situation</w:t>
             </w:r>
@@ -1045,21 +672,11 @@
         </w:tc>
         <w:tc>
           <w:tcPr>
-            <w:tcW w:type="dxa" w:w="6690"/>
-            <w:tcMar>
-              <w:top w:w="80" w:type="dxa"/>
-              <w:bottom w:w="80" w:type="dxa"/>
-              <w:start w:w="120" w:type="dxa"/>
-              <w:end w:w="120" w:type="dxa"/>
-              <w:left w:w="120" w:type="dxa"/>
-              <w:right w:w="120" w:type="dxa"/>
-            </w:tcMar>
+            <w:tcW w:type="dxa" w:w="4320"/>
           </w:tcPr>
           <w:p>
+            <w:r/>
             <w:r>
-              <w:rPr>
-                <w:sz w:val="19"/>
-              </w:rPr>
               <w:t>29 ans, étudiant en BTS SIO (reconversion pro)</w:t>
             </w:r>
           </w:p>
@@ -1068,23 +685,13 @@
       <w:tr>
         <w:tc>
           <w:tcPr>
-            <w:tcW w:type="dxa" w:w="2381"/>
-            <w:shd w:val="clear" w:color="auto" w:fill="EAF2F8"/>
-            <w:tcMar>
-              <w:top w:w="80" w:type="dxa"/>
-              <w:bottom w:w="80" w:type="dxa"/>
-              <w:start w:w="120" w:type="dxa"/>
-              <w:end w:w="120" w:type="dxa"/>
-              <w:left w:w="120" w:type="dxa"/>
-              <w:right w:w="120" w:type="dxa"/>
-            </w:tcMar>
+            <w:tcW w:type="dxa" w:w="4320"/>
           </w:tcPr>
           <w:p>
+            <w:r/>
             <w:r>
               <w:rPr>
                 <w:b/>
-                <w:color w:val="1F4E79"/>
-                <w:sz w:val="19"/>
               </w:rPr>
               <w:t>Aisance numérique</w:t>
             </w:r>
@@ -1092,22 +699,21 @@
         </w:tc>
         <w:tc>
           <w:tcPr>
-            <w:tcW w:type="dxa" w:w="6690"/>
-            <w:tcMar>
-              <w:top w:w="80" w:type="dxa"/>
-              <w:bottom w:w="80" w:type="dxa"/>
-              <w:start w:w="120" w:type="dxa"/>
-              <w:end w:w="120" w:type="dxa"/>
-              <w:left w:w="120" w:type="dxa"/>
-              <w:right w:w="120" w:type="dxa"/>
-            </w:tcMar>
+            <w:tcW w:type="dxa" w:w="4320"/>
           </w:tcPr>
           <w:p>
+            <w:r/>
+            <w:r>
+              <w:t xml:space="preserve">Bonne, mais soucieux de la </w:t>
+            </w:r>
             <w:r>
               <w:rPr>
-                <w:sz w:val="19"/>
+                <w:b/>
               </w:rPr>
-              <w:t>Bonne, mais soucieux de la confidentialité de ses données</w:t>
+              <w:t>confidentialité</w:t>
+            </w:r>
+            <w:r>
+              <w:t xml:space="preserve"> de ses données</w:t>
             </w:r>
           </w:p>
         </w:tc>
@@ -1115,23 +721,13 @@
       <w:tr>
         <w:tc>
           <w:tcPr>
-            <w:tcW w:type="dxa" w:w="2381"/>
-            <w:shd w:val="clear" w:color="auto" w:fill="EAF2F8"/>
-            <w:tcMar>
-              <w:top w:w="80" w:type="dxa"/>
-              <w:bottom w:w="80" w:type="dxa"/>
-              <w:start w:w="120" w:type="dxa"/>
-              <w:end w:w="120" w:type="dxa"/>
-              <w:left w:w="120" w:type="dxa"/>
-              <w:right w:w="120" w:type="dxa"/>
-            </w:tcMar>
+            <w:tcW w:type="dxa" w:w="4320"/>
           </w:tcPr>
           <w:p>
+            <w:r/>
             <w:r>
               <w:rPr>
                 <w:b/>
-                <w:color w:val="1F4E79"/>
-                <w:sz w:val="19"/>
               </w:rPr>
               <w:t>Contexte</w:t>
             </w:r>
@@ -1139,233 +735,39 @@
         </w:tc>
         <w:tc>
           <w:tcPr>
-            <w:tcW w:type="dxa" w:w="6690"/>
-            <w:tcMar>
-              <w:top w:w="80" w:type="dxa"/>
-              <w:bottom w:w="80" w:type="dxa"/>
-              <w:start w:w="120" w:type="dxa"/>
-              <w:end w:w="120" w:type="dxa"/>
-              <w:left w:w="120" w:type="dxa"/>
-              <w:right w:w="120" w:type="dxa"/>
-            </w:tcMar>
+            <w:tcW w:type="dxa" w:w="4320"/>
           </w:tcPr>
           <w:p>
+            <w:r/>
             <w:r>
-              <w:rPr>
-                <w:sz w:val="19"/>
-              </w:rPr>
               <w:t>Révise régulièrement, sur ordinateur, par sessions planifiées</w:t>
             </w:r>
           </w:p>
         </w:tc>
       </w:tr>
-    </w:tbl>
-    <w:p>
-      <w:pPr>
-        <w:spacing w:after="40" w:before="160"/>
-      </w:pPr>
-      <w:r>
-        <w:rPr>
-          <w:b/>
-          <w:i w:val="0"/>
-          <w:color w:val="2E86C1"/>
-          <w:sz w:val="22"/>
-        </w:rPr>
-        <w:t>Objectifs</w:t>
-      </w:r>
-    </w:p>
-    <w:p>
-      <w:pPr>
-        <w:pStyle w:val="ListBullet"/>
-        <w:spacing w:after="40"/>
-      </w:pPr>
-      <w:r>
-        <w:rPr>
-          <w:sz w:val="20"/>
-        </w:rPr>
-        <w:t>Réviser régulièrement et mesurer sa progression sur plusieurs semaines.</w:t>
-      </w:r>
-    </w:p>
-    <w:p>
-      <w:pPr>
-        <w:pStyle w:val="ListBullet"/>
-        <w:spacing w:after="40"/>
-      </w:pPr>
-      <w:r>
-        <w:rPr>
-          <w:sz w:val="20"/>
-        </w:rPr>
-        <w:t>Cibler ses révisions sur ses erreurs passées.</w:t>
-      </w:r>
-    </w:p>
-    <w:p>
-      <w:pPr>
-        <w:pStyle w:val="ListBullet"/>
-        <w:spacing w:after="40"/>
-      </w:pPr>
-      <w:r>
-        <w:rPr>
-          <w:sz w:val="20"/>
-        </w:rPr>
-        <w:t>S'assurer que ses documents restent privés.</w:t>
-      </w:r>
-    </w:p>
-    <w:p>
-      <w:pPr>
-        <w:spacing w:after="40" w:before="120"/>
-      </w:pPr>
-      <w:r>
-        <w:rPr>
-          <w:b/>
-          <w:i w:val="0"/>
-          <w:color w:val="2E86C1"/>
-          <w:sz w:val="22"/>
-        </w:rPr>
-        <w:t>Frustrations</w:t>
-      </w:r>
-    </w:p>
-    <w:p>
-      <w:pPr>
-        <w:pStyle w:val="ListBullet"/>
-        <w:spacing w:after="40"/>
-      </w:pPr>
-      <w:r>
-        <w:rPr>
-          <w:sz w:val="20"/>
-        </w:rPr>
-        <w:t>Outils qui envoient les contenus à des services cloud externes.</w:t>
-      </w:r>
-    </w:p>
-    <w:p>
-      <w:pPr>
-        <w:pStyle w:val="ListBullet"/>
-        <w:spacing w:after="40"/>
-      </w:pPr>
-      <w:r>
-        <w:rPr>
-          <w:sz w:val="20"/>
-        </w:rPr>
-        <w:t>Pas de suivi de l'évolution des scores dans le temps.</w:t>
-      </w:r>
-    </w:p>
-    <w:p>
-      <w:pPr>
-        <w:pStyle w:val="ListBullet"/>
-        <w:spacing w:after="40"/>
-      </w:pPr>
-      <w:r>
-        <w:rPr>
-          <w:sz w:val="20"/>
-        </w:rPr>
-        <w:t>Devoir recréer un compte / perdre son historique.</w:t>
-      </w:r>
-    </w:p>
-    <w:p>
-      <w:pPr>
-        <w:spacing w:after="40" w:before="120"/>
-      </w:pPr>
-      <w:r>
-        <w:rPr>
-          <w:b/>
-          <w:i w:val="0"/>
-          <w:color w:val="2E86C1"/>
-          <w:sz w:val="22"/>
-        </w:rPr>
-        <w:t>Besoins → User stories</w:t>
-      </w:r>
-    </w:p>
-    <w:p>
-      <w:pPr>
-        <w:pStyle w:val="ListBullet"/>
-        <w:spacing w:after="40"/>
-      </w:pPr>
-      <w:r>
-        <w:rPr>
-          <w:sz w:val="20"/>
-        </w:rPr>
-        <w:t>Compte fiable, email vérifié, mot de passe récupérable  → US-F1.1 à US-F1.5</w:t>
-      </w:r>
-    </w:p>
-    <w:p>
-      <w:pPr>
-        <w:pStyle w:val="ListBullet"/>
-        <w:spacing w:after="40"/>
-      </w:pPr>
-      <w:r>
-        <w:rPr>
-          <w:sz w:val="20"/>
-        </w:rPr>
-        <w:t>Historique persistant (date, cours, score)  → US-F6.1, US-F6.2</w:t>
-      </w:r>
-    </w:p>
-    <w:p>
-      <w:pPr>
-        <w:pStyle w:val="ListBullet"/>
-        <w:spacing w:after="40"/>
-      </w:pPr>
-      <w:r>
-        <w:rPr>
-          <w:sz w:val="20"/>
-        </w:rPr>
-        <w:t>Rejouer un quiz ciblé sur ses erreurs  → US-Q.1 (should)</w:t>
-      </w:r>
-    </w:p>
-    <w:p>
-      <w:pPr>
-        <w:pStyle w:val="ListBullet"/>
-        <w:spacing w:after="40"/>
-      </w:pPr>
-      <w:r>
-        <w:rPr>
-          <w:sz w:val="20"/>
-        </w:rPr>
-        <w:t>Garantie RGPD : LLM local (Ollama)  → contrainte transverse E7</w:t>
-      </w:r>
-    </w:p>
-    <w:tbl>
-      <w:tblPr>
-        <w:tblW w:type="auto" w:w="0"/>
-        <w:tblLook w:firstColumn="1" w:firstRow="1" w:lastColumn="0" w:lastRow="0" w:noHBand="0" w:noVBand="1" w:val="04A0"/>
-        <w:tblBorders>
-          <w:top w:val="none"/>
-          <w:left w:val="none"/>
-          <w:bottom w:val="none"/>
-          <w:right w:val="none"/>
-          <w:insideH w:val="none"/>
-          <w:insideV w:val="none"/>
-        </w:tblBorders>
-      </w:tblPr>
-      <w:tblGrid>
-        <w:gridCol w:w="8640"/>
-      </w:tblGrid>
       <w:tr>
         <w:tc>
           <w:tcPr>
-            <w:tcW w:type="dxa" w:w="8640"/>
-            <w:shd w:val="clear" w:color="auto" w:fill="FFF6E5"/>
-            <w:tcMar>
-              <w:top w:w="120" w:type="dxa"/>
-              <w:bottom w:w="120" w:type="dxa"/>
-              <w:start w:w="160" w:type="dxa"/>
-              <w:end w:w="160" w:type="dxa"/>
-              <w:left w:w="160" w:type="dxa"/>
-              <w:right w:w="160" w:type="dxa"/>
-            </w:tcMar>
+            <w:tcW w:type="dxa" w:w="4320"/>
           </w:tcPr>
           <w:p>
+            <w:r/>
             <w:r>
               <w:rPr>
                 <w:b/>
-                <w:color w:val="B9770E"/>
-                <w:sz w:val="19"/>
               </w:rPr>
-              <w:t xml:space="preserve">Scénario type  </w:t>
+              <w:t>Citation</w:t>
             </w:r>
+          </w:p>
+        </w:tc>
+        <w:tc>
+          <w:tcPr>
+            <w:tcW w:type="dxa" w:w="4320"/>
+          </w:tcPr>
+          <w:p>
+            <w:r/>
             <w:r>
-              <w:rPr>
-                <w:sz w:val="19"/>
-              </w:rPr>
-              <w:t>Karim se connecte chaque dimanche, consulte ses scores des 3 dernières semaines, relance un quiz sur le chapitre où il plafonne à 5/10.</w:t>
+              <w:t>« Je veux progresser dans la durée, pas bachoter — et savoir où vont mes données. »</w:t>
             </w:r>
           </w:p>
         </w:tc>
@@ -1374,145 +776,204 @@
     <w:p/>
     <w:p>
       <w:r>
-        <w:br w:type="page"/>
+        <w:rPr>
+          <w:b/>
+        </w:rPr>
+        <w:t>Objectifs</w:t>
+      </w:r>
+    </w:p>
+    <w:p>
+      <w:pPr>
+        <w:pStyle w:val="ListBullet"/>
+      </w:pPr>
+      <w:r>
+        <w:t>Réviser de façon régulière et mesurer sa progression sur plusieurs semaines.</w:t>
+      </w:r>
+    </w:p>
+    <w:p>
+      <w:pPr>
+        <w:pStyle w:val="ListBullet"/>
+      </w:pPr>
+      <w:r>
+        <w:t>Cibler ses révisions sur ses erreurs passées.</w:t>
+      </w:r>
+    </w:p>
+    <w:p>
+      <w:pPr>
+        <w:pStyle w:val="ListBullet"/>
+      </w:pPr>
+      <w:r>
+        <w:t xml:space="preserve">S'assurer que ses documents restent </w:t>
+      </w:r>
+      <w:r>
+        <w:rPr>
+          <w:b/>
+        </w:rPr>
+        <w:t>privés</w:t>
+      </w:r>
+      <w:r>
+        <w:t>.</w:t>
+      </w:r>
+    </w:p>
+    <w:p>
+      <w:r>
+        <w:rPr>
+          <w:b/>
+        </w:rPr>
+        <w:t>Frustrations</w:t>
+      </w:r>
+    </w:p>
+    <w:p>
+      <w:pPr>
+        <w:pStyle w:val="ListBullet"/>
+      </w:pPr>
+      <w:r>
+        <w:t>Outils qui envoient les contenus à des services cloud externes.</w:t>
+      </w:r>
+    </w:p>
+    <w:p>
+      <w:pPr>
+        <w:pStyle w:val="ListBullet"/>
+      </w:pPr>
+      <w:r>
+        <w:t>Pas de suivi de l'évolution des scores dans le temps.</w:t>
+      </w:r>
+    </w:p>
+    <w:p>
+      <w:pPr>
+        <w:pStyle w:val="ListBullet"/>
+      </w:pPr>
+      <w:r>
+        <w:t>Devoir recréer un compte / perdre son historique.</w:t>
+      </w:r>
+    </w:p>
+    <w:p>
+      <w:r>
+        <w:rPr>
+          <w:b/>
+        </w:rPr>
+        <w:t>Besoins → User stories</w:t>
+      </w:r>
+    </w:p>
+    <w:p>
+      <w:pPr>
+        <w:pStyle w:val="ListBullet"/>
+      </w:pPr>
+      <w:r>
+        <w:t xml:space="preserve">Compte fiable, email vérifié, mot de passe récupérable → </w:t>
+      </w:r>
+      <w:r>
+        <w:rPr>
+          <w:b/>
+        </w:rPr>
+        <w:t>US-F1.1 à US-F1.5</w:t>
+      </w:r>
+    </w:p>
+    <w:p>
+      <w:pPr>
+        <w:pStyle w:val="ListBullet"/>
+      </w:pPr>
+      <w:r>
+        <w:t xml:space="preserve">Historique persistant (date, cours, score) → </w:t>
+      </w:r>
+      <w:r>
+        <w:rPr>
+          <w:b/>
+        </w:rPr>
+        <w:t>US-F6.1, US-F6.2</w:t>
+      </w:r>
+    </w:p>
+    <w:p>
+      <w:pPr>
+        <w:pStyle w:val="ListBullet"/>
+      </w:pPr>
+      <w:r>
+        <w:t xml:space="preserve">Rejouer un quiz ciblé sur ses erreurs → </w:t>
+      </w:r>
+      <w:r>
+        <w:rPr>
+          <w:b/>
+        </w:rPr>
+        <w:t>US-Q.1</w:t>
+      </w:r>
+      <w:r>
+        <w:t xml:space="preserve"> (should)</w:t>
+      </w:r>
+    </w:p>
+    <w:p>
+      <w:pPr>
+        <w:pStyle w:val="ListBullet"/>
+      </w:pPr>
+      <w:r>
+        <w:t xml:space="preserve">Garantie RGPD : LLM </w:t>
+      </w:r>
+      <w:r>
+        <w:rPr>
+          <w:b/>
+        </w:rPr>
+        <w:t>local</w:t>
+      </w:r>
+      <w:r>
+        <w:t xml:space="preserve"> (Ollama), aucune donnée envoyée au cloud → contrainte transverse (E7)</w:t>
+      </w:r>
+    </w:p>
+    <w:p>
+      <w:r>
+        <w:rPr>
+          <w:b/>
+        </w:rPr>
+        <w:t>Scénario type</w:t>
+      </w:r>
+      <w:r>
+        <w:t xml:space="preserve"> : Karim se connecte chaque dimanche, consulte ses scores des 3 dernières semaines, relance un quiz sur le chapitre où il plafonne à 5/10.</w:t>
+      </w:r>
+    </w:p>
+    <w:p>
+      <w:pPr>
+        <w:pStyle w:val="Heading1"/>
+      </w:pPr>
+      <w:r>
+        <w:t>4. Persona primaire #3 — Mme Sophie Lefèvre, l'enseignante qui pilote sa classe</w:t>
+      </w:r>
+    </w:p>
+    <w:p>
+      <w:pPr>
+        <w:ind w:left="454"/>
+      </w:pPr>
+      <w:r>
+        <w:rPr>
+          <w:b/>
+        </w:rPr>
+        <w:t>Persona issue de la perturbation J1 (Produit).</w:t>
+      </w:r>
+      <w:r>
+        <w:t xml:space="preserve"> Initialement présentée par le PO comme cible secondaire, elle est désormais </w:t>
+      </w:r>
+      <w:r>
+        <w:rPr>
+          <w:b/>
+        </w:rPr>
+        <w:t>cible principale, au même niveau que l'étudiant</w:t>
+      </w:r>
+      <w:r>
+        <w:t xml:space="preserve">. Ses besoins remontent en conséquence dans le périmètre </w:t>
+      </w:r>
+      <w:r>
+        <w:rPr>
+          <w:b/>
+        </w:rPr>
+        <w:t>must-have / Release 1</w:t>
+      </w:r>
+      <w:r>
+        <w:t xml:space="preserve"> (voir Perturbation J1).</w:t>
       </w:r>
     </w:p>
     <w:tbl>
       <w:tblPr>
+        <w:tblStyle w:val="LightGrid-Accent1"/>
         <w:tblW w:type="auto" w:w="0"/>
+        <w:jc w:val="center"/>
         <w:tblLook w:firstColumn="1" w:firstRow="1" w:lastColumn="0" w:lastRow="0" w:noHBand="0" w:noVBand="1" w:val="04A0"/>
-        <w:tblBorders>
-          <w:top w:val="none"/>
-          <w:left w:val="none"/>
-          <w:bottom w:val="none"/>
-          <w:right w:val="none"/>
-          <w:insideH w:val="none"/>
-          <w:insideV w:val="none"/>
-        </w:tblBorders>
-      </w:tblPr>
-      <w:tblGrid>
-        <w:gridCol w:w="2041"/>
-        <w:gridCol w:w="7030"/>
-      </w:tblGrid>
-      <w:tr>
-        <w:tc>
-          <w:tcPr>
-            <w:tcW w:type="dxa" w:w="2041"/>
-            <w:shd w:val="clear" w:color="auto" w:fill="F4F8FB"/>
-            <w:tcMar>
-              <w:top w:w="120" w:type="dxa"/>
-              <w:bottom w:w="120" w:type="dxa"/>
-              <w:start w:w="120" w:type="dxa"/>
-              <w:end w:w="120" w:type="dxa"/>
-              <w:left w:w="120" w:type="dxa"/>
-              <w:right w:w="120" w:type="dxa"/>
-            </w:tcMar>
-          </w:tcPr>
-          <w:p>
-            <w:pPr>
-              <w:jc w:val="center"/>
-            </w:pPr>
-            <w:r>
-              <w:drawing>
-                <wp:inline xmlns:a="http://schemas.openxmlformats.org/drawingml/2006/main" xmlns:pic="http://schemas.openxmlformats.org/drawingml/2006/picture">
-                  <wp:extent cx="1044000" cy="1044000"/>
-                  <wp:docPr id="3" name="Picture 3"/>
-                  <wp:cNvGraphicFramePr>
-                    <a:graphicFrameLocks noChangeAspect="1"/>
-                  </wp:cNvGraphicFramePr>
-                  <a:graphic>
-                    <a:graphicData uri="http://schemas.openxmlformats.org/drawingml/2006/picture">
-                      <pic:pic>
-                        <pic:nvPicPr>
-                          <pic:cNvPr id="0" name="nadia.jpg"/>
-                          <pic:cNvPicPr/>
-                        </pic:nvPicPr>
-                        <pic:blipFill>
-                          <a:blip r:embed="rId11"/>
-                          <a:stretch>
-                            <a:fillRect/>
-                          </a:stretch>
-                        </pic:blipFill>
-                        <pic:spPr>
-                          <a:xfrm>
-                            <a:off x="0" y="0"/>
-                            <a:ext cx="1044000" cy="1044000"/>
-                          </a:xfrm>
-                          <a:prstGeom prst="rect"/>
-                        </pic:spPr>
-                      </pic:pic>
-                    </a:graphicData>
-                  </a:graphic>
-                </wp:inline>
-              </w:drawing>
-            </w:r>
-          </w:p>
-        </w:tc>
-        <w:tc>
-          <w:tcPr>
-            <w:tcW w:type="dxa" w:w="7030"/>
-            <w:shd w:val="clear" w:color="auto" w:fill="F4F8FB"/>
-            <w:tcMar>
-              <w:top w:w="120" w:type="dxa"/>
-              <w:bottom w:w="120" w:type="dxa"/>
-              <w:start w:w="160" w:type="dxa"/>
-              <w:end w:w="160" w:type="dxa"/>
-              <w:left w:w="160" w:type="dxa"/>
-              <w:right w:w="160" w:type="dxa"/>
-            </w:tcMar>
-          </w:tcPr>
-          <w:p>
-            <w:r>
-              <w:rPr>
-                <w:b/>
-                <w:color w:val="1F4E79"/>
-                <w:sz w:val="32"/>
-              </w:rPr>
-              <w:t>4. Mme Nadia — l'enseignante (vision teacher-first)</w:t>
-            </w:r>
-          </w:p>
-          <w:p>
-            <w:pPr>
-              <w:spacing w:after="80"/>
-            </w:pPr>
-            <w:r>
-              <w:rPr>
-                <w:b/>
-                <w:color w:val="FFFFFF"/>
-                <w:sz w:val="18"/>
-                <w:shd w:val="clear" w:fill="1F4E79"/>
-              </w:rPr>
-              <w:t xml:space="preserve">  PERSONA SECONDAIRE  </w:t>
-            </w:r>
-          </w:p>
-          <w:p>
-            <w:pPr>
-              <w:spacing w:before="40"/>
-            </w:pPr>
-            <w:r>
-              <w:rPr>
-                <w:i/>
-                <w:color w:val="2E86C1"/>
-                <w:sz w:val="21"/>
-              </w:rPr>
-              <w:t>« Je veux des quiz fidèles à mon cours, sans y passer mes soirées. »</w:t>
-            </w:r>
-          </w:p>
-        </w:tc>
-      </w:tr>
-    </w:tbl>
-    <w:tbl>
-      <w:tblPr>
-        <w:tblW w:type="auto" w:w="0"/>
-        <w:tblLook w:firstColumn="1" w:firstRow="1" w:lastColumn="0" w:lastRow="0" w:noHBand="0" w:noVBand="1" w:val="04A0"/>
-        <w:tblBorders>
-          <w:top w:val="none"/>
-          <w:left w:val="none"/>
-          <w:bottom w:val="none"/>
-          <w:right w:val="none"/>
-          <w:insideH w:val="none"/>
-          <w:insideV w:val="none"/>
-        </w:tblBorders>
       </w:tblPr>
       <w:tblGrid>
         <w:gridCol w:w="4320"/>
@@ -1521,23 +982,41 @@
       <w:tr>
         <w:tc>
           <w:tcPr>
-            <w:tcW w:type="dxa" w:w="2381"/>
-            <w:shd w:val="clear" w:color="auto" w:fill="EAF2F8"/>
-            <w:tcMar>
-              <w:top w:w="80" w:type="dxa"/>
-              <w:bottom w:w="80" w:type="dxa"/>
-              <w:start w:w="120" w:type="dxa"/>
-              <w:end w:w="120" w:type="dxa"/>
-              <w:left w:w="120" w:type="dxa"/>
-              <w:right w:w="120" w:type="dxa"/>
-            </w:tcMar>
+            <w:tcW w:type="dxa" w:w="4320"/>
           </w:tcPr>
           <w:p>
+            <w:r/>
             <w:r>
               <w:rPr>
                 <w:b/>
-                <w:color w:val="1F4E79"/>
-                <w:sz w:val="19"/>
+              </w:rPr>
+            </w:r>
+          </w:p>
+        </w:tc>
+        <w:tc>
+          <w:tcPr>
+            <w:tcW w:type="dxa" w:w="4320"/>
+          </w:tcPr>
+          <w:p>
+            <w:r/>
+            <w:r>
+              <w:rPr>
+                <w:b/>
+              </w:rPr>
+            </w:r>
+          </w:p>
+        </w:tc>
+      </w:tr>
+      <w:tr>
+        <w:tc>
+          <w:tcPr>
+            <w:tcW w:type="dxa" w:w="4320"/>
+          </w:tcPr>
+          <w:p>
+            <w:r/>
+            <w:r>
+              <w:rPr>
+                <w:b/>
               </w:rPr>
               <w:t>Âge / situation</w:t>
             </w:r>
@@ -1545,22 +1024,12 @@
         </w:tc>
         <w:tc>
           <w:tcPr>
-            <w:tcW w:type="dxa" w:w="6690"/>
-            <w:tcMar>
-              <w:top w:w="80" w:type="dxa"/>
-              <w:bottom w:w="80" w:type="dxa"/>
-              <w:start w:w="120" w:type="dxa"/>
-              <w:end w:w="120" w:type="dxa"/>
-              <w:left w:w="120" w:type="dxa"/>
-              <w:right w:w="120" w:type="dxa"/>
-            </w:tcMar>
+            <w:tcW w:type="dxa" w:w="4320"/>
           </w:tcPr>
           <w:p>
+            <w:r/>
             <w:r>
-              <w:rPr>
-                <w:sz w:val="19"/>
-              </w:rPr>
-              <w:t>41 ans, enseignante en IUT</w:t>
+              <w:t>42 ans, enseignante en BTS Communication à Lyon</w:t>
             </w:r>
           </w:p>
         </w:tc>
@@ -1568,23 +1037,13 @@
       <w:tr>
         <w:tc>
           <w:tcPr>
-            <w:tcW w:type="dxa" w:w="2381"/>
-            <w:shd w:val="clear" w:color="auto" w:fill="EAF2F8"/>
-            <w:tcMar>
-              <w:top w:w="80" w:type="dxa"/>
-              <w:bottom w:w="80" w:type="dxa"/>
-              <w:start w:w="120" w:type="dxa"/>
-              <w:end w:w="120" w:type="dxa"/>
-              <w:left w:w="120" w:type="dxa"/>
-              <w:right w:w="120" w:type="dxa"/>
-            </w:tcMar>
+            <w:tcW w:type="dxa" w:w="4320"/>
           </w:tcPr>
           <w:p>
+            <w:r/>
             <w:r>
               <w:rPr>
                 <w:b/>
-                <w:color w:val="1F4E79"/>
-                <w:sz w:val="19"/>
               </w:rPr>
               <w:t>Aisance numérique</w:t>
             </w:r>
@@ -1592,22 +1051,12 @@
         </w:tc>
         <w:tc>
           <w:tcPr>
-            <w:tcW w:type="dxa" w:w="6690"/>
-            <w:tcMar>
-              <w:top w:w="80" w:type="dxa"/>
-              <w:bottom w:w="80" w:type="dxa"/>
-              <w:start w:w="120" w:type="dxa"/>
-              <w:end w:w="120" w:type="dxa"/>
-              <w:left w:w="120" w:type="dxa"/>
-              <w:right w:w="120" w:type="dxa"/>
-            </w:tcMar>
+            <w:tcW w:type="dxa" w:w="4320"/>
           </w:tcPr>
           <w:p>
+            <w:r/>
             <w:r>
-              <w:rPr>
-                <w:sz w:val="19"/>
-              </w:rPr>
-              <w:t>Moyenne, peu de temps pour de nouveaux outils</w:t>
+              <w:t>Moyenne, peu de temps à consacrer à de nouveaux outils</w:t>
             </w:r>
           </w:p>
         </w:tc>
@@ -1615,23 +1064,13 @@
       <w:tr>
         <w:tc>
           <w:tcPr>
-            <w:tcW w:type="dxa" w:w="2381"/>
-            <w:shd w:val="clear" w:color="auto" w:fill="EAF2F8"/>
-            <w:tcMar>
-              <w:top w:w="80" w:type="dxa"/>
-              <w:bottom w:w="80" w:type="dxa"/>
-              <w:start w:w="120" w:type="dxa"/>
-              <w:end w:w="120" w:type="dxa"/>
-              <w:left w:w="120" w:type="dxa"/>
-              <w:right w:w="120" w:type="dxa"/>
-            </w:tcMar>
+            <w:tcW w:type="dxa" w:w="4320"/>
           </w:tcPr>
           <w:p>
+            <w:r/>
             <w:r>
               <w:rPr>
                 <w:b/>
-                <w:color w:val="1F4E79"/>
-                <w:sz w:val="19"/>
               </w:rPr>
               <w:t>Contexte</w:t>
             </w:r>
@@ -1639,221 +1078,57 @@
         </w:tc>
         <w:tc>
           <w:tcPr>
-            <w:tcW w:type="dxa" w:w="6690"/>
-            <w:tcMar>
-              <w:top w:w="80" w:type="dxa"/>
-              <w:bottom w:w="80" w:type="dxa"/>
-              <w:start w:w="120" w:type="dxa"/>
-              <w:end w:w="120" w:type="dxa"/>
-              <w:left w:w="120" w:type="dxa"/>
-              <w:right w:w="120" w:type="dxa"/>
-            </w:tcMar>
+            <w:tcW w:type="dxa" w:w="4320"/>
           </w:tcPr>
           <w:p>
+            <w:r/>
+            <w:r>
+              <w:t xml:space="preserve">Encadre </w:t>
+            </w:r>
             <w:r>
               <w:rPr>
-                <w:sz w:val="19"/>
+                <w:b/>
               </w:rPr>
-              <w:t>Veut proposer de l'auto-évaluation à ses étudiants à partir de ses supports</w:t>
+              <w:t>28 étudiants</w:t>
+            </w:r>
+            <w:r>
+              <w:t xml:space="preserve"> en révision d'examens ; veut un outil de suivi à partir de </w:t>
+            </w:r>
+            <w:r>
+              <w:rPr>
+                <w:b/>
+              </w:rPr>
+              <w:t>ses</w:t>
+            </w:r>
+            <w:r>
+              <w:t xml:space="preserve"> supports</w:t>
             </w:r>
           </w:p>
         </w:tc>
       </w:tr>
-    </w:tbl>
-    <w:p>
-      <w:pPr>
-        <w:spacing w:after="40" w:before="160"/>
-      </w:pPr>
-      <w:r>
-        <w:rPr>
-          <w:b/>
-          <w:i w:val="0"/>
-          <w:color w:val="2E86C1"/>
-          <w:sz w:val="22"/>
-        </w:rPr>
-        <w:t>Objectifs</w:t>
-      </w:r>
-    </w:p>
-    <w:p>
-      <w:pPr>
-        <w:pStyle w:val="ListBullet"/>
-        <w:spacing w:after="40"/>
-      </w:pPr>
-      <w:r>
-        <w:rPr>
-          <w:sz w:val="20"/>
-        </w:rPr>
-        <w:t>Générer des QCM alignés sur ses propres supports de cours.</w:t>
-      </w:r>
-    </w:p>
-    <w:p>
-      <w:pPr>
-        <w:pStyle w:val="ListBullet"/>
-        <w:spacing w:after="40"/>
-      </w:pPr>
-      <w:r>
-        <w:rPr>
-          <w:sz w:val="20"/>
-        </w:rPr>
-        <w:t>Offrir un outil d'entraînement à ses étudiants.</w:t>
-      </w:r>
-    </w:p>
-    <w:p>
-      <w:pPr>
-        <w:pStyle w:val="ListBullet"/>
-        <w:spacing w:after="40"/>
-      </w:pPr>
-      <w:r>
-        <w:rPr>
-          <w:sz w:val="20"/>
-        </w:rPr>
-        <w:t>(R2) Suivre la progression d'une classe.</w:t>
-      </w:r>
-    </w:p>
-    <w:p>
-      <w:pPr>
-        <w:spacing w:after="40" w:before="120"/>
-      </w:pPr>
-      <w:r>
-        <w:rPr>
-          <w:b/>
-          <w:i w:val="0"/>
-          <w:color w:val="2E86C1"/>
-          <w:sz w:val="22"/>
-        </w:rPr>
-        <w:t>Frustrations</w:t>
-      </w:r>
-    </w:p>
-    <w:p>
-      <w:pPr>
-        <w:pStyle w:val="ListBullet"/>
-        <w:spacing w:after="40"/>
-      </w:pPr>
-      <w:r>
-        <w:rPr>
-          <w:sz w:val="20"/>
-        </w:rPr>
-        <w:t>Créer des QCM manuellement est chronophage.</w:t>
-      </w:r>
-    </w:p>
-    <w:p>
-      <w:pPr>
-        <w:pStyle w:val="ListBullet"/>
-        <w:spacing w:after="40"/>
-      </w:pPr>
-      <w:r>
-        <w:rPr>
-          <w:sz w:val="20"/>
-        </w:rPr>
-        <w:t>Outils pensés pour l'étudiant, jamais pour le pédagogue.</w:t>
-      </w:r>
-    </w:p>
-    <w:p>
-      <w:pPr>
-        <w:pStyle w:val="ListBullet"/>
-        <w:spacing w:after="40"/>
-      </w:pPr>
-      <w:r>
-        <w:rPr>
-          <w:sz w:val="20"/>
-        </w:rPr>
-        <w:t>Crainte sur la conformité RGPD des données des étudiants.</w:t>
-      </w:r>
-    </w:p>
-    <w:p>
-      <w:pPr>
-        <w:spacing w:after="40" w:before="120"/>
-      </w:pPr>
-      <w:r>
-        <w:rPr>
-          <w:b/>
-          <w:i w:val="0"/>
-          <w:color w:val="2E86C1"/>
-          <w:sz w:val="22"/>
-        </w:rPr>
-        <w:t>Besoins → User stories</w:t>
-      </w:r>
-    </w:p>
-    <w:p>
-      <w:pPr>
-        <w:pStyle w:val="ListBullet"/>
-        <w:spacing w:after="40"/>
-      </w:pPr>
-      <w:r>
-        <w:rPr>
-          <w:sz w:val="20"/>
-        </w:rPr>
-        <w:t>Génération ancrée dans les supports (RAG)  → US-F3.1, renforcé US-R2.1</w:t>
-      </w:r>
-    </w:p>
-    <w:p>
-      <w:pPr>
-        <w:pStyle w:val="ListBullet"/>
-        <w:spacing w:after="40"/>
-      </w:pPr>
-      <w:r>
-        <w:rPr>
-          <w:sz w:val="20"/>
-        </w:rPr>
-        <w:t>Tableau de bord enseignant / suivi de classe  → US-R2.2 (Release 2)</w:t>
-      </w:r>
-    </w:p>
-    <w:p>
-      <w:pPr>
-        <w:pStyle w:val="ListBullet"/>
-        <w:spacing w:after="40"/>
-      </w:pPr>
-      <w:r>
-        <w:rPr>
-          <w:sz w:val="20"/>
-        </w:rPr>
-        <w:t>Niveaux de difficulté des QCM  → US-R2.3 (Release 2)</w:t>
-      </w:r>
-    </w:p>
-    <w:tbl>
-      <w:tblPr>
-        <w:tblW w:type="auto" w:w="0"/>
-        <w:tblLook w:firstColumn="1" w:firstRow="1" w:lastColumn="0" w:lastRow="0" w:noHBand="0" w:noVBand="1" w:val="04A0"/>
-        <w:tblBorders>
-          <w:top w:val="none"/>
-          <w:left w:val="none"/>
-          <w:bottom w:val="none"/>
-          <w:right w:val="none"/>
-          <w:insideH w:val="none"/>
-          <w:insideV w:val="none"/>
-        </w:tblBorders>
-      </w:tblPr>
-      <w:tblGrid>
-        <w:gridCol w:w="8640"/>
-      </w:tblGrid>
       <w:tr>
         <w:tc>
           <w:tcPr>
-            <w:tcW w:type="dxa" w:w="8640"/>
-            <w:shd w:val="clear" w:color="auto" w:fill="FFF6E5"/>
-            <w:tcMar>
-              <w:top w:w="120" w:type="dxa"/>
-              <w:bottom w:w="120" w:type="dxa"/>
-              <w:start w:w="160" w:type="dxa"/>
-              <w:end w:w="160" w:type="dxa"/>
-              <w:left w:w="160" w:type="dxa"/>
-              <w:right w:w="160" w:type="dxa"/>
-            </w:tcMar>
+            <w:tcW w:type="dxa" w:w="4320"/>
           </w:tcPr>
           <w:p>
+            <w:r/>
             <w:r>
               <w:rPr>
                 <w:b/>
-                <w:color w:val="B9770E"/>
-                <w:sz w:val="19"/>
               </w:rPr>
-              <w:t xml:space="preserve">Scénario type  </w:t>
+              <w:t>Citation</w:t>
             </w:r>
+          </w:p>
+        </w:tc>
+        <w:tc>
+          <w:tcPr>
+            <w:tcW w:type="dxa" w:w="4320"/>
+          </w:tcPr>
+          <w:p>
+            <w:r/>
             <w:r>
-              <w:rPr>
-                <w:sz w:val="19"/>
-              </w:rPr>
-              <w:t>Ce persona porte la différenciation produit (enseignant-first) mais ses besoins relèvent majoritairement de la Release 2. Il oriente la vision, pas le MVP de la semaine.</w:t>
+              <w:t>« C'est exactement l'outil qu'il me faut pour suivre la progression de mes 28 étudiants en révision d'examens. Je veux pouvoir voir leurs scores, repérer ceux qui décrochent, et leur envoyer des conseils. »</w:t>
             </w:r>
           </w:p>
         </w:tc>
@@ -1862,145 +1137,270 @@
     <w:p/>
     <w:p>
       <w:r>
-        <w:br w:type="page"/>
+        <w:rPr>
+          <w:b/>
+        </w:rPr>
+        <w:t>Objectifs</w:t>
+      </w:r>
+    </w:p>
+    <w:p>
+      <w:pPr>
+        <w:pStyle w:val="ListBullet"/>
+      </w:pPr>
+      <w:r>
+        <w:t xml:space="preserve">Suivre la </w:t>
+      </w:r>
+      <w:r>
+        <w:rPr>
+          <w:b/>
+        </w:rPr>
+        <w:t>progression</w:t>
+      </w:r>
+      <w:r>
+        <w:t xml:space="preserve"> de ses 28 étudiants sur leurs révisions.</w:t>
+      </w:r>
+    </w:p>
+    <w:p>
+      <w:pPr>
+        <w:pStyle w:val="ListBullet"/>
+      </w:pPr>
+      <w:r>
+        <w:rPr>
+          <w:b/>
+        </w:rPr>
+        <w:t>Repérer rapidement les décrocheurs</w:t>
+      </w:r>
+      <w:r>
+        <w:t xml:space="preserve"> (objectif : en 3 clics).</w:t>
+      </w:r>
+    </w:p>
+    <w:p>
+      <w:pPr>
+        <w:pStyle w:val="ListBullet"/>
+      </w:pPr>
+      <w:r>
+        <w:rPr>
+          <w:b/>
+        </w:rPr>
+        <w:t>Envoyer des conseils ciblés</w:t>
+      </w:r>
+      <w:r>
+        <w:t xml:space="preserve"> aux étudiants en difficulté.</w:t>
+      </w:r>
+    </w:p>
+    <w:p>
+      <w:pPr>
+        <w:pStyle w:val="ListBullet"/>
+      </w:pPr>
+      <w:r>
+        <w:t xml:space="preserve">Proposer des quiz </w:t>
+      </w:r>
+      <w:r>
+        <w:rPr>
+          <w:b/>
+        </w:rPr>
+        <w:t>fidèles à ses propres supports de cours</w:t>
+      </w:r>
+      <w:r>
+        <w:t xml:space="preserve"> (RAG).</w:t>
+      </w:r>
+    </w:p>
+    <w:p>
+      <w:r>
+        <w:rPr>
+          <w:b/>
+        </w:rPr>
+        <w:t>Frustrations</w:t>
+      </w:r>
+    </w:p>
+    <w:p>
+      <w:pPr>
+        <w:pStyle w:val="ListBullet"/>
+      </w:pPr>
+      <w:r>
+        <w:t>Aucune vue d'ensemble : impossible de savoir qui décroche sans interroger chaque étudiant.</w:t>
+      </w:r>
+    </w:p>
+    <w:p>
+      <w:pPr>
+        <w:pStyle w:val="ListBullet"/>
+      </w:pPr>
+      <w:r>
+        <w:t>Créer des QCM manuellement est chronophage.</w:t>
+      </w:r>
+    </w:p>
+    <w:p>
+      <w:pPr>
+        <w:pStyle w:val="ListBullet"/>
+      </w:pPr>
+      <w:r>
+        <w:t>Outils pensés uniquement pour l'étudiant, jamais pour le pédagogue.</w:t>
+      </w:r>
+    </w:p>
+    <w:p>
+      <w:pPr>
+        <w:pStyle w:val="ListBullet"/>
+      </w:pPr>
+      <w:r>
+        <w:t>Crainte sur la conformité RGPD des données de ses étudiants.</w:t>
+      </w:r>
+    </w:p>
+    <w:p>
+      <w:r>
+        <w:rPr>
+          <w:b/>
+        </w:rPr>
+        <w:t>Besoins → User stories</w:t>
+      </w:r>
+      <w:r>
+        <w:t xml:space="preserve"> </w:t>
+      </w:r>
+      <w:r>
+        <w:rPr>
+          <w:i/>
+        </w:rPr>
+        <w:t>(nouvelles stories Espace enseignant, must-have suite à la perturbation J1)</w:t>
+      </w:r>
+    </w:p>
+    <w:p>
+      <w:pPr>
+        <w:pStyle w:val="ListBullet"/>
+      </w:pPr>
+      <w:r>
+        <w:t xml:space="preserve">Tableau de bord enseignant : scores et progression de la classe → </w:t>
+      </w:r>
+      <w:r>
+        <w:rPr>
+          <w:b/>
+        </w:rPr>
+        <w:t>US-T.1</w:t>
+      </w:r>
+    </w:p>
+    <w:p>
+      <w:pPr>
+        <w:pStyle w:val="ListBullet"/>
+      </w:pPr>
+      <w:r>
+        <w:t xml:space="preserve">Repérage des décrocheurs en ≤ 3 clics (tri/alerte sur scores faibles) → </w:t>
+      </w:r>
+      <w:r>
+        <w:rPr>
+          <w:b/>
+        </w:rPr>
+        <w:t>US-T.2</w:t>
+      </w:r>
+    </w:p>
+    <w:p>
+      <w:pPr>
+        <w:pStyle w:val="ListBullet"/>
+      </w:pPr>
+      <w:r>
+        <w:t xml:space="preserve">Envoi de conseils ciblés à un étudiant en difficulté → </w:t>
+      </w:r>
+      <w:r>
+        <w:rPr>
+          <w:b/>
+        </w:rPr>
+        <w:t>US-T.3</w:t>
+      </w:r>
+    </w:p>
+    <w:p>
+      <w:pPr>
+        <w:pStyle w:val="ListBullet"/>
+      </w:pPr>
+      <w:r>
+        <w:t xml:space="preserve">Génération de QCM ancrée dans ses supports (RAG) → </w:t>
+      </w:r>
+      <w:r>
+        <w:rPr>
+          <w:b/>
+        </w:rPr>
+        <w:t>US-F3.1</w:t>
+      </w:r>
+      <w:r>
+        <w:t xml:space="preserve"> (mutualisé avec les étudiants)</w:t>
+      </w:r>
+    </w:p>
+    <w:p>
+      <w:pPr>
+        <w:pStyle w:val="ListBullet"/>
+      </w:pPr>
+      <w:r>
+        <w:t xml:space="preserve">Garantie RGPD : LLM </w:t>
+      </w:r>
+      <w:r>
+        <w:rPr>
+          <w:b/>
+        </w:rPr>
+        <w:t>local</w:t>
+      </w:r>
+      <w:r>
+        <w:t xml:space="preserve"> (Ollama), données des étudiants non envoyées au cloud → contrainte transverse (E7)</w:t>
+      </w:r>
+    </w:p>
+    <w:p>
+      <w:r>
+        <w:rPr>
+          <w:b/>
+        </w:rPr>
+        <w:t>Scénario type</w:t>
+      </w:r>
+      <w:r>
+        <w:t xml:space="preserve"> : Mme Lefèvre se connecte à l'espace enseignant, ouvre le tableau de bord de sa classe, repère en 3 clics les 4 étudiants sous la moyenne sur le dernier chapitre, et leur envoie un conseil de révision ciblé.</w:t>
+      </w:r>
+    </w:p>
+    <w:p>
+      <w:r>
+        <w:rPr>
+          <w:b/>
+        </w:rPr>
+        <w:t>Note de cadrage</w:t>
+      </w:r>
+      <w:r>
+        <w:t xml:space="preserve"> : ce persona porte la </w:t>
+      </w:r>
+      <w:r>
+        <w:rPr>
+          <w:b/>
+        </w:rPr>
+        <w:t>différenciation produit</w:t>
+      </w:r>
+      <w:r>
+        <w:t xml:space="preserve"> (</w:t>
+      </w:r>
+      <w:r>
+        <w:rPr>
+          <w:i/>
+        </w:rPr>
+        <w:t>enseignant-first</w:t>
+      </w:r>
+      <w:r>
+        <w:t xml:space="preserve">). Avec la perturbation J1, le tableau de bord de classe, le repérage des décrocheurs et l'envoi de conseils </w:t>
+      </w:r>
+      <w:r>
+        <w:rPr>
+          <w:b/>
+        </w:rPr>
+        <w:t>entrent dans le périmètre prioritaire</w:t>
+      </w:r>
+      <w:r>
+        <w:t xml:space="preserve"> (et ne sont plus repoussés en Release 2). Le backlog (GitHub Issues / Product Backlog) doit être actualisé en conséquence.</w:t>
+      </w:r>
+    </w:p>
+    <w:p>
+      <w:pPr>
+        <w:pStyle w:val="Heading1"/>
+      </w:pPr>
+      <w:r>
+        <w:t>5. Anti-persona — Thomas, le candidat à un concours généraliste</w:t>
       </w:r>
     </w:p>
     <w:tbl>
       <w:tblPr>
+        <w:tblStyle w:val="LightGrid-Accent1"/>
         <w:tblW w:type="auto" w:w="0"/>
+        <w:jc w:val="center"/>
         <w:tblLook w:firstColumn="1" w:firstRow="1" w:lastColumn="0" w:lastRow="0" w:noHBand="0" w:noVBand="1" w:val="04A0"/>
-        <w:tblBorders>
-          <w:top w:val="none"/>
-          <w:left w:val="none"/>
-          <w:bottom w:val="none"/>
-          <w:right w:val="none"/>
-          <w:insideH w:val="none"/>
-          <w:insideV w:val="none"/>
-        </w:tblBorders>
-      </w:tblPr>
-      <w:tblGrid>
-        <w:gridCol w:w="2041"/>
-        <w:gridCol w:w="7030"/>
-      </w:tblGrid>
-      <w:tr>
-        <w:tc>
-          <w:tcPr>
-            <w:tcW w:type="dxa" w:w="2041"/>
-            <w:shd w:val="clear" w:color="auto" w:fill="F4F8FB"/>
-            <w:tcMar>
-              <w:top w:w="120" w:type="dxa"/>
-              <w:bottom w:w="120" w:type="dxa"/>
-              <w:start w:w="120" w:type="dxa"/>
-              <w:end w:w="120" w:type="dxa"/>
-              <w:left w:w="120" w:type="dxa"/>
-              <w:right w:w="120" w:type="dxa"/>
-            </w:tcMar>
-          </w:tcPr>
-          <w:p>
-            <w:pPr>
-              <w:jc w:val="center"/>
-            </w:pPr>
-            <w:r>
-              <w:drawing>
-                <wp:inline xmlns:a="http://schemas.openxmlformats.org/drawingml/2006/main" xmlns:pic="http://schemas.openxmlformats.org/drawingml/2006/picture">
-                  <wp:extent cx="1044000" cy="1044000"/>
-                  <wp:docPr id="4" name="Picture 4"/>
-                  <wp:cNvGraphicFramePr>
-                    <a:graphicFrameLocks noChangeAspect="1"/>
-                  </wp:cNvGraphicFramePr>
-                  <a:graphic>
-                    <a:graphicData uri="http://schemas.openxmlformats.org/drawingml/2006/picture">
-                      <pic:pic>
-                        <pic:nvPicPr>
-                          <pic:cNvPr id="0" name="thomas.jpg"/>
-                          <pic:cNvPicPr/>
-                        </pic:nvPicPr>
-                        <pic:blipFill>
-                          <a:blip r:embed="rId12"/>
-                          <a:stretch>
-                            <a:fillRect/>
-                          </a:stretch>
-                        </pic:blipFill>
-                        <pic:spPr>
-                          <a:xfrm>
-                            <a:off x="0" y="0"/>
-                            <a:ext cx="1044000" cy="1044000"/>
-                          </a:xfrm>
-                          <a:prstGeom prst="rect"/>
-                        </pic:spPr>
-                      </pic:pic>
-                    </a:graphicData>
-                  </a:graphic>
-                </wp:inline>
-              </w:drawing>
-            </w:r>
-          </w:p>
-        </w:tc>
-        <w:tc>
-          <w:tcPr>
-            <w:tcW w:type="dxa" w:w="7030"/>
-            <w:shd w:val="clear" w:color="auto" w:fill="F4F8FB"/>
-            <w:tcMar>
-              <w:top w:w="120" w:type="dxa"/>
-              <w:bottom w:w="120" w:type="dxa"/>
-              <w:start w:w="160" w:type="dxa"/>
-              <w:end w:w="160" w:type="dxa"/>
-              <w:left w:w="160" w:type="dxa"/>
-              <w:right w:w="160" w:type="dxa"/>
-            </w:tcMar>
-          </w:tcPr>
-          <w:p>
-            <w:r>
-              <w:rPr>
-                <w:b/>
-                <w:color w:val="1F4E79"/>
-                <w:sz w:val="32"/>
-              </w:rPr>
-              <w:t>5. Thomas — l'anti-persona (concours généraliste)</w:t>
-            </w:r>
-          </w:p>
-          <w:p>
-            <w:pPr>
-              <w:spacing w:after="80"/>
-            </w:pPr>
-            <w:r>
-              <w:rPr>
-                <w:b/>
-                <w:color w:val="FFFFFF"/>
-                <w:sz w:val="18"/>
-                <w:shd w:val="clear" w:fill="7F8C8D"/>
-              </w:rPr>
-              <w:t xml:space="preserve">  ANTI-PERSONA  </w:t>
-            </w:r>
-          </w:p>
-          <w:p>
-            <w:pPr>
-              <w:spacing w:before="40"/>
-            </w:pPr>
-            <w:r>
-              <w:rPr>
-                <w:i/>
-                <w:color w:val="2E86C1"/>
-                <w:sz w:val="21"/>
-              </w:rPr>
-              <w:t>« Je veux une banque de QCM toute prête, sans fournir mes cours. »</w:t>
-            </w:r>
-          </w:p>
-        </w:tc>
-      </w:tr>
-    </w:tbl>
-    <w:tbl>
-      <w:tblPr>
-        <w:tblW w:type="auto" w:w="0"/>
-        <w:tblLook w:firstColumn="1" w:firstRow="1" w:lastColumn="0" w:lastRow="0" w:noHBand="0" w:noVBand="1" w:val="04A0"/>
-        <w:tblBorders>
-          <w:top w:val="none"/>
-          <w:left w:val="none"/>
-          <w:bottom w:val="none"/>
-          <w:right w:val="none"/>
-          <w:insideH w:val="none"/>
-          <w:insideV w:val="none"/>
-        </w:tblBorders>
       </w:tblPr>
       <w:tblGrid>
         <w:gridCol w:w="4320"/>
@@ -2009,23 +1409,41 @@
       <w:tr>
         <w:tc>
           <w:tcPr>
-            <w:tcW w:type="dxa" w:w="2381"/>
-            <w:shd w:val="clear" w:color="auto" w:fill="EAF2F8"/>
-            <w:tcMar>
-              <w:top w:w="80" w:type="dxa"/>
-              <w:bottom w:w="80" w:type="dxa"/>
-              <w:start w:w="120" w:type="dxa"/>
-              <w:end w:w="120" w:type="dxa"/>
-              <w:left w:w="120" w:type="dxa"/>
-              <w:right w:w="120" w:type="dxa"/>
-            </w:tcMar>
+            <w:tcW w:type="dxa" w:w="4320"/>
           </w:tcPr>
           <w:p>
+            <w:r/>
             <w:r>
               <w:rPr>
                 <w:b/>
-                <w:color w:val="1F4E79"/>
-                <w:sz w:val="19"/>
+              </w:rPr>
+            </w:r>
+          </w:p>
+        </w:tc>
+        <w:tc>
+          <w:tcPr>
+            <w:tcW w:type="dxa" w:w="4320"/>
+          </w:tcPr>
+          <w:p>
+            <w:r/>
+            <w:r>
+              <w:rPr>
+                <w:b/>
+              </w:rPr>
+            </w:r>
+          </w:p>
+        </w:tc>
+      </w:tr>
+      <w:tr>
+        <w:tc>
+          <w:tcPr>
+            <w:tcW w:type="dxa" w:w="4320"/>
+          </w:tcPr>
+          <w:p>
+            <w:r/>
+            <w:r>
+              <w:rPr>
+                <w:b/>
               </w:rPr>
               <w:t>Profil</w:t>
             </w:r>
@@ -2033,22 +1451,21 @@
         </w:tc>
         <w:tc>
           <w:tcPr>
-            <w:tcW w:type="dxa" w:w="6690"/>
-            <w:tcMar>
-              <w:top w:w="80" w:type="dxa"/>
-              <w:bottom w:w="80" w:type="dxa"/>
-              <w:start w:w="120" w:type="dxa"/>
-              <w:end w:w="120" w:type="dxa"/>
-              <w:left w:w="120" w:type="dxa"/>
-              <w:right w:w="120" w:type="dxa"/>
-            </w:tcMar>
+            <w:tcW w:type="dxa" w:w="4320"/>
           </w:tcPr>
           <w:p>
+            <w:r/>
+            <w:r>
+              <w:t xml:space="preserve">Cherche une banque de QCM </w:t>
+            </w:r>
             <w:r>
               <w:rPr>
-                <w:sz w:val="19"/>
+                <w:b/>
               </w:rPr>
-              <w:t>Cherche une banque de QCM générique, sans fournir de document</w:t>
+              <w:t>toute prête</w:t>
+            </w:r>
+            <w:r>
+              <w:t>, sans fournir de cours</w:t>
             </w:r>
           </w:p>
         </w:tc>
@@ -2056,23 +1473,13 @@
       <w:tr>
         <w:tc>
           <w:tcPr>
-            <w:tcW w:type="dxa" w:w="2381"/>
-            <w:shd w:val="clear" w:color="auto" w:fill="EAF2F8"/>
-            <w:tcMar>
-              <w:top w:w="80" w:type="dxa"/>
-              <w:bottom w:w="80" w:type="dxa"/>
-              <w:start w:w="120" w:type="dxa"/>
-              <w:end w:w="120" w:type="dxa"/>
-              <w:left w:w="120" w:type="dxa"/>
-              <w:right w:w="120" w:type="dxa"/>
-            </w:tcMar>
+            <w:tcW w:type="dxa" w:w="4320"/>
           </w:tcPr>
           <w:p>
+            <w:r/>
             <w:r>
               <w:rPr>
                 <w:b/>
-                <w:color w:val="1F4E79"/>
-                <w:sz w:val="19"/>
               </w:rPr>
               <w:t>Attente</w:t>
             </w:r>
@@ -2080,173 +1487,12 @@
         </w:tc>
         <w:tc>
           <w:tcPr>
-            <w:tcW w:type="dxa" w:w="6690"/>
-            <w:tcMar>
-              <w:top w:w="80" w:type="dxa"/>
-              <w:bottom w:w="80" w:type="dxa"/>
-              <w:start w:w="120" w:type="dxa"/>
-              <w:end w:w="120" w:type="dxa"/>
-              <w:left w:w="120" w:type="dxa"/>
-              <w:right w:w="120" w:type="dxa"/>
-            </w:tcMar>
+            <w:tcW w:type="dxa" w:w="4320"/>
           </w:tcPr>
           <w:p>
+            <w:r/>
             <w:r>
-              <w:rPr>
-                <w:sz w:val="19"/>
-              </w:rPr>
-              <w:t>Culture générale toute prête, classement entre candidats, gamification poussée</w:t>
-            </w:r>
-          </w:p>
-        </w:tc>
-      </w:tr>
-    </w:tbl>
-    <w:p>
-      <w:pPr>
-        <w:spacing w:after="40" w:before="160"/>
-      </w:pPr>
-      <w:r>
-        <w:rPr>
-          <w:b/>
-          <w:i w:val="0"/>
-          <w:color w:val="2E86C1"/>
-          <w:sz w:val="22"/>
-        </w:rPr>
-        <w:t>Objectifs</w:t>
-      </w:r>
-    </w:p>
-    <w:p>
-      <w:pPr>
-        <w:pStyle w:val="ListBullet"/>
-        <w:spacing w:after="40"/>
-      </w:pPr>
-      <w:r>
-        <w:rPr>
-          <w:sz w:val="20"/>
-        </w:rPr>
-        <w:t>Réviser sans effort de préparation, à partir de contenu existant.</w:t>
-      </w:r>
-    </w:p>
-    <w:p>
-      <w:pPr>
-        <w:pStyle w:val="ListBullet"/>
-        <w:spacing w:after="40"/>
-      </w:pPr>
-      <w:r>
-        <w:rPr>
-          <w:sz w:val="20"/>
-        </w:rPr>
-        <w:t>Se comparer à d'autres candidats.</w:t>
-      </w:r>
-    </w:p>
-    <w:p>
-      <w:pPr>
-        <w:spacing w:after="40" w:before="120"/>
-      </w:pPr>
-      <w:r>
-        <w:rPr>
-          <w:b/>
-          <w:i w:val="0"/>
-          <w:color w:val="2E86C1"/>
-          <w:sz w:val="22"/>
-        </w:rPr>
-        <w:t>Frustrations</w:t>
-      </w:r>
-    </w:p>
-    <w:p>
-      <w:pPr>
-        <w:pStyle w:val="ListBullet"/>
-        <w:spacing w:after="40"/>
-      </w:pPr>
-      <w:r>
-        <w:rPr>
-          <w:sz w:val="20"/>
-        </w:rPr>
-        <w:t>(non pertinent — hors cible produit)</w:t>
-      </w:r>
-    </w:p>
-    <w:p>
-      <w:pPr>
-        <w:spacing w:after="40" w:before="120"/>
-      </w:pPr>
-      <w:r>
-        <w:rPr>
-          <w:b/>
-          <w:i w:val="0"/>
-          <w:color w:val="2E86C1"/>
-          <w:sz w:val="22"/>
-        </w:rPr>
-        <w:t>Besoins → User stories</w:t>
-      </w:r>
-    </w:p>
-    <w:p>
-      <w:pPr>
-        <w:pStyle w:val="ListBullet"/>
-        <w:spacing w:after="40"/>
-      </w:pPr>
-      <w:r>
-        <w:rPr>
-          <w:sz w:val="20"/>
-        </w:rPr>
-        <w:t>Contenu générique universel  → Hors périmètre — US-W.x</w:t>
-      </w:r>
-    </w:p>
-    <w:p>
-      <w:pPr>
-        <w:pStyle w:val="ListBullet"/>
-        <w:spacing w:after="40"/>
-      </w:pPr>
-      <w:r>
-        <w:rPr>
-          <w:sz w:val="20"/>
-        </w:rPr>
-        <w:t>Compétition entre utilisateurs  → Hors périmètre — US-W.x</w:t>
-      </w:r>
-    </w:p>
-    <w:tbl>
-      <w:tblPr>
-        <w:tblW w:type="auto" w:w="0"/>
-        <w:tblLook w:firstColumn="1" w:firstRow="1" w:lastColumn="0" w:lastRow="0" w:noHBand="0" w:noVBand="1" w:val="04A0"/>
-        <w:tblBorders>
-          <w:top w:val="none"/>
-          <w:left w:val="none"/>
-          <w:bottom w:val="none"/>
-          <w:right w:val="none"/>
-          <w:insideH w:val="none"/>
-          <w:insideV w:val="none"/>
-        </w:tblBorders>
-      </w:tblPr>
-      <w:tblGrid>
-        <w:gridCol w:w="8640"/>
-      </w:tblGrid>
-      <w:tr>
-        <w:tc>
-          <w:tcPr>
-            <w:tcW w:type="dxa" w:w="8640"/>
-            <w:shd w:val="clear" w:color="auto" w:fill="FFF6E5"/>
-            <w:tcMar>
-              <w:top w:w="120" w:type="dxa"/>
-              <w:bottom w:w="120" w:type="dxa"/>
-              <w:start w:w="160" w:type="dxa"/>
-              <w:end w:w="160" w:type="dxa"/>
-              <w:left w:w="160" w:type="dxa"/>
-              <w:right w:w="160" w:type="dxa"/>
-            </w:tcMar>
-          </w:tcPr>
-          <w:p>
-            <w:r>
-              <w:rPr>
-                <w:b/>
-                <w:color w:val="B9770E"/>
-                <w:sz w:val="19"/>
-              </w:rPr>
-              <w:t xml:space="preserve">Scénario type  </w:t>
-            </w:r>
-            <w:r>
-              <w:rPr>
-                <w:sz w:val="19"/>
-              </w:rPr>
-              <w:t>EduTutor IA génère des quiz à partir des documents de l'utilisateur (ancrage RAG), pas une base universelle. Cadrer cet anti-persona évite de dériver vers un « Quizlet généraliste ».</w:t>
+              <w:t>Du contenu générique de culture générale, du classement entre candidats, du gamification poussé</w:t>
             </w:r>
           </w:p>
         </w:tc>
@@ -2254,23 +1500,47 @@
     </w:tbl>
     <w:p/>
     <w:p>
-      <w:pPr>
-        <w:spacing w:after="160" w:before="80"/>
-      </w:pPr>
       <w:r>
         <w:rPr>
           <w:b/>
-          <w:i w:val="0"/>
-          <w:color w:val="1F4E79"/>
-          <w:sz w:val="30"/>
         </w:rPr>
-        <w:t>6. Synthèse &amp; priorisation</w:t>
+        <w:t>Pourquoi hors cible</w:t>
+      </w:r>
+      <w:r>
+        <w:t xml:space="preserve"> : EduTutor IA génère des quiz </w:t>
+      </w:r>
+      <w:r>
+        <w:rPr>
+          <w:b/>
+        </w:rPr>
+        <w:t>à partir des documents de l'utilisateur</w:t>
+      </w:r>
+      <w:r>
+        <w:t xml:space="preserve"> (ancrage RAG), pas une base de questions universelle. Le produit ne vise ni la compétition entre utilisateurs, ni le contenu générique → cf. </w:t>
+      </w:r>
+      <w:r>
+        <w:rPr>
+          <w:b/>
+        </w:rPr>
+        <w:t>US-W.1/W.2</w:t>
+      </w:r>
+      <w:r>
+        <w:t xml:space="preserve"> (Won't have). Cadrer cet anti-persona évite de dériver vers un « Quizlet généraliste ».</w:t>
+      </w:r>
+    </w:p>
+    <w:p>
+      <w:pPr>
+        <w:pStyle w:val="Heading1"/>
+      </w:pPr>
+      <w:r>
+        <w:t>6. Synthèse priorisation</w:t>
       </w:r>
     </w:p>
     <w:tbl>
       <w:tblPr>
         <w:tblStyle w:val="LightGrid-Accent1"/>
         <w:tblW w:type="auto" w:w="0"/>
+        <w:jc w:val="center"/>
         <w:tblLook w:firstColumn="1" w:firstRow="1" w:lastColumn="0" w:lastRow="0" w:noHBand="0" w:noVBand="1" w:val="04A0"/>
       </w:tblPr>
       <w:tblGrid>
@@ -2283,14 +1553,12 @@
         <w:tc>
           <w:tcPr>
             <w:tcW w:type="dxa" w:w="2160"/>
-            <w:shd w:val="clear" w:color="auto" w:fill="1F4E79"/>
           </w:tcPr>
           <w:p>
+            <w:r/>
             <w:r>
               <w:rPr>
                 <w:b/>
-                <w:color w:val="FFFFFF"/>
-                <w:sz w:val="20"/>
               </w:rPr>
               <w:t>Persona</w:t>
             </w:r>
@@ -2299,14 +1567,12 @@
         <w:tc>
           <w:tcPr>
             <w:tcW w:type="dxa" w:w="2160"/>
-            <w:shd w:val="clear" w:color="auto" w:fill="1F4E79"/>
           </w:tcPr>
           <w:p>
+            <w:r/>
             <w:r>
               <w:rPr>
                 <w:b/>
-                <w:color w:val="FFFFFF"/>
-                <w:sz w:val="20"/>
               </w:rPr>
               <w:t>Type</w:t>
             </w:r>
@@ -2315,14 +1581,12 @@
         <w:tc>
           <w:tcPr>
             <w:tcW w:type="dxa" w:w="2160"/>
-            <w:shd w:val="clear" w:color="auto" w:fill="1F4E79"/>
           </w:tcPr>
           <w:p>
+            <w:r/>
             <w:r>
               <w:rPr>
                 <w:b/>
-                <w:color w:val="FFFFFF"/>
-                <w:sz w:val="20"/>
               </w:rPr>
               <w:t>Pilote</w:t>
             </w:r>
@@ -2331,14 +1595,12 @@
         <w:tc>
           <w:tcPr>
             <w:tcW w:type="dxa" w:w="2160"/>
-            <w:shd w:val="clear" w:color="auto" w:fill="1F4E79"/>
           </w:tcPr>
           <w:p>
+            <w:r/>
             <w:r>
               <w:rPr>
                 <w:b/>
-                <w:color w:val="FFFFFF"/>
-                <w:sz w:val="20"/>
               </w:rPr>
               <w:t>Stories clés</w:t>
             </w:r>
@@ -2351,11 +1613,10 @@
             <w:tcW w:type="dxa" w:w="2160"/>
           </w:tcPr>
           <w:p>
+            <w:r/>
             <w:r>
               <w:rPr>
                 <w:b/>
-                <w:color w:val="1F4E79"/>
-                <w:sz w:val="19"/>
               </w:rPr>
               <w:t>Léa</w:t>
             </w:r>
@@ -2366,11 +1627,9 @@
             <w:tcW w:type="dxa" w:w="2160"/>
           </w:tcPr>
           <w:p>
+            <w:r/>
             <w:r>
-              <w:rPr>
-                <w:sz w:val="19"/>
-              </w:rPr>
-              <w:t>Primaire</w:t>
+              <w:t>Primaire (étudiant)</w:t>
             </w:r>
           </w:p>
         </w:tc>
@@ -2379,10 +1638,8 @@
             <w:tcW w:type="dxa" w:w="2160"/>
           </w:tcPr>
           <w:p>
+            <w:r/>
             <w:r>
-              <w:rPr>
-                <w:sz w:val="19"/>
-              </w:rPr>
               <w:t>MVP F2/F3/F5/F6</w:t>
             </w:r>
           </w:p>
@@ -2392,10 +1649,8 @@
             <w:tcW w:type="dxa" w:w="2160"/>
           </w:tcPr>
           <w:p>
+            <w:r/>
             <w:r>
-              <w:rPr>
-                <w:sz w:val="19"/>
-              </w:rPr>
               <w:t>US-F2.x, US-F3.1, US-F5.x, US-F6.1</w:t>
             </w:r>
           </w:p>
@@ -2407,11 +1662,10 @@
             <w:tcW w:type="dxa" w:w="2160"/>
           </w:tcPr>
           <w:p>
+            <w:r/>
             <w:r>
               <w:rPr>
                 <w:b/>
-                <w:color w:val="1F4E79"/>
-                <w:sz w:val="19"/>
               </w:rPr>
               <w:t>Karim</w:t>
             </w:r>
@@ -2422,11 +1676,9 @@
             <w:tcW w:type="dxa" w:w="2160"/>
           </w:tcPr>
           <w:p>
+            <w:r/>
             <w:r>
-              <w:rPr>
-                <w:sz w:val="19"/>
-              </w:rPr>
-              <w:t>Primaire</w:t>
+              <w:t>Primaire (étudiant)</w:t>
             </w:r>
           </w:p>
         </w:tc>
@@ -2435,10 +1687,8 @@
             <w:tcW w:type="dxa" w:w="2160"/>
           </w:tcPr>
           <w:p>
+            <w:r/>
             <w:r>
-              <w:rPr>
-                <w:sz w:val="19"/>
-              </w:rPr>
               <w:t>MVP F1/F6 + RGPD</w:t>
             </w:r>
           </w:p>
@@ -2448,10 +1698,8 @@
             <w:tcW w:type="dxa" w:w="2160"/>
           </w:tcPr>
           <w:p>
+            <w:r/>
             <w:r>
-              <w:rPr>
-                <w:sz w:val="19"/>
-              </w:rPr>
               <w:t>US-F1.x, US-F6.x, US-Q.1</w:t>
             </w:r>
           </w:p>
@@ -2463,13 +1711,12 @@
             <w:tcW w:type="dxa" w:w="2160"/>
           </w:tcPr>
           <w:p>
+            <w:r/>
             <w:r>
               <w:rPr>
                 <w:b/>
-                <w:color w:val="1F4E79"/>
-                <w:sz w:val="19"/>
               </w:rPr>
-              <w:t>Nadia</w:t>
+              <w:t>Sophie Lefèvre</w:t>
             </w:r>
           </w:p>
         </w:tc>
@@ -2478,11 +1725,9 @@
             <w:tcW w:type="dxa" w:w="2160"/>
           </w:tcPr>
           <w:p>
+            <w:r/>
             <w:r>
-              <w:rPr>
-                <w:sz w:val="19"/>
-              </w:rPr>
-              <w:t>Secondaire</w:t>
+              <w:t>Primaire (enseignante, perturbation J1)</w:t>
             </w:r>
           </w:p>
         </w:tc>
@@ -2491,11 +1736,9 @@
             <w:tcW w:type="dxa" w:w="2160"/>
           </w:tcPr>
           <w:p>
+            <w:r/>
             <w:r>
-              <w:rPr>
-                <w:sz w:val="19"/>
-              </w:rPr>
-              <w:t>Vision R2</w:t>
+              <w:t>MVP Espace enseignant + F3</w:t>
             </w:r>
           </w:p>
         </w:tc>
@@ -2504,11 +1747,9 @@
             <w:tcW w:type="dxa" w:w="2160"/>
           </w:tcPr>
           <w:p>
+            <w:r/>
             <w:r>
-              <w:rPr>
-                <w:sz w:val="19"/>
-              </w:rPr>
-              <w:t>US-F3.1, US-R2.1/2.2/2.3</w:t>
+              <w:t>US-T.1, US-T.2, US-T.3, US-F3.1</w:t>
             </w:r>
           </w:p>
         </w:tc>
@@ -2519,11 +1760,10 @@
             <w:tcW w:type="dxa" w:w="2160"/>
           </w:tcPr>
           <w:p>
+            <w:r/>
             <w:r>
               <w:rPr>
                 <w:b/>
-                <w:color w:val="1F4E79"/>
-                <w:sz w:val="19"/>
               </w:rPr>
               <w:t>Thomas</w:t>
             </w:r>
@@ -2534,10 +1774,8 @@
             <w:tcW w:type="dxa" w:w="2160"/>
           </w:tcPr>
           <w:p>
+            <w:r/>
             <w:r>
-              <w:rPr>
-                <w:sz w:val="19"/>
-              </w:rPr>
               <w:t>Anti-persona</w:t>
             </w:r>
           </w:p>
@@ -2547,10 +1785,8 @@
             <w:tcW w:type="dxa" w:w="2160"/>
           </w:tcPr>
           <w:p>
+            <w:r/>
             <w:r>
-              <w:rPr>
-                <w:sz w:val="19"/>
-              </w:rPr>
               <w:t>Hors périmètre</w:t>
             </w:r>
           </w:p>
@@ -2560,54 +1796,48 @@
             <w:tcW w:type="dxa" w:w="2160"/>
           </w:tcPr>
           <w:p>
+            <w:r/>
             <w:r>
-              <w:rPr>
-                <w:sz w:val="19"/>
-              </w:rPr>
               <w:t>US-W.x</w:t>
             </w:r>
           </w:p>
         </w:tc>
       </w:tr>
     </w:tbl>
+    <w:p/>
     <w:p>
-      <w:pPr>
-        <w:spacing w:after="40" w:before="200"/>
-      </w:pPr>
       <w:r>
         <w:rPr>
           <w:b/>
-          <w:i w:val="0"/>
-          <w:color w:val="2E86C1"/>
-          <w:sz w:val="22"/>
         </w:rPr>
         <w:t>À retenir pour le Product Owner</w:t>
       </w:r>
-    </w:p>
-    <w:p>
-      <w:pPr>
-        <w:spacing w:after="200" w:before="0"/>
-      </w:pPr>
+      <w:r>
+        <w:t xml:space="preserve"> : depuis la perturbation J1, le </w:t>
+      </w:r>
       <w:r>
         <w:rPr>
-          <w:b w:val="0"/>
-          <w:i w:val="0"/>
-          <w:color w:val="222222"/>
-          <w:sz w:val="21"/>
+          <w:b/>
         </w:rPr>
-        <w:t>Le Sprint 1 sert d'abord Léa et Karim (les deux étudiants). Les besoins de Nadia nourrissent le Release Planning R2 mais ne doivent pas entrer dans le périmètre must-have de la semaine.</w:t>
+        <w:t>Sprint 1 sert deux cibles principales</w:t>
+      </w:r>
+      <w:r>
+        <w:t xml:space="preserve"> — les étudiants (Léa, Karim) </w:t>
+      </w:r>
+      <w:r>
+        <w:rPr>
+          <w:b/>
+        </w:rPr>
+        <w:t>et</w:t>
+      </w:r>
+      <w:r>
+        <w:t xml:space="preserve"> l'enseignante (Mme Lefèvre). Les fonctionnalités de suivi de classe, autrefois en Release 2, font désormais partie du périmètre prioritaire.</w:t>
       </w:r>
     </w:p>
     <w:p>
-      <w:pPr>
-        <w:spacing w:after="80" w:before="240"/>
-      </w:pPr>
       <w:r>
         <w:rPr>
-          <w:b w:val="0"/>
           <w:i/>
-          <w:color w:val="555555"/>
-          <w:sz w:val="18"/>
         </w:rPr>
         <w:t>Document vivant — à affiner après les premiers retours utilisateurs. Source de vérité du périmètre : GitHub Issues &amp; Project du dépôt.</w:t>
       </w:r>
@@ -2987,8 +2217,7 @@
     <w:rsid w:val="00FC693F"/>
     <w:rPr>
       <w:rFonts w:ascii="Calibri" w:hAnsi="Calibri"/>
-      <w:color w:val="222222"/>
-      <w:sz w:val="21"/>
+      <w:sz w:val="22"/>
     </w:rPr>
   </w:style>
   <w:style w:type="paragraph" w:styleId="Header">

</xml_diff>